<commit_message>
Add dp_025-027, Decision Fatigue bias, CAT cross-references, and counter-tactic
</commit_message>
<xml_diff>
--- a/Engagement Ethics Benchmark — Full Draft.docx
+++ b/Engagement Ethics Benchmark — Full Draft.docx
@@ -93,27 +93,7 @@
           <w:sz w:val="26"/>
           <w:szCs w:val="26"/>
         </w:rPr>
-        <w:t xml:space="preserve">Rachel </w:t>
-      </w:r>
-      <w:proofErr w:type="gramStart"/>
-      <w:r>
-        <w:rPr>
-          <w:b/>
-          <w:bCs/>
-          <w:sz w:val="26"/>
-          <w:szCs w:val="26"/>
-        </w:rPr>
-        <w:t>Weatherly  |</w:t>
-      </w:r>
-      <w:proofErr w:type="gramEnd"/>
-      <w:r>
-        <w:rPr>
-          <w:b/>
-          <w:bCs/>
-          <w:sz w:val="26"/>
-          <w:szCs w:val="26"/>
-        </w:rPr>
-        <w:t xml:space="preserve">  Engaging Me</w:t>
+        <w:t>Rachel Weatherly  |  Engaging Me</w:t>
       </w:r>
     </w:p>
     <w:p>
@@ -161,7 +141,7 @@
         <w:spacing w:after="120"/>
       </w:pPr>
       <w:r>
-        <w:t>Agentic AI systems represent the first technology capable of deploying behavioral influence at unlimited scale, with unlimited personalization, across every domain of human life — and increasingly without moment-to-moment human oversight. Existing frameworks for ethical AI design address data privacy, fairness, and transparency but do not provide a principled basis for distinguishing legitimate engagement from behavioral manipulation at the tactic level. This paper presents the Engagement Ethics Benchmark: a framework that uses an established engagement model for human behavior change as the ethical standard against which agentic AI design can be evaluated. The benchmark maps a 54-entry cognitive bias taxonomy to engagement tactics and introduces a 24-pattern dark pattern library specific to AI agent contexts, including four original dark patterns with no equivalent in prior taxonomies. Eight new ethical counter-tactics are derived to fill identified gaps in the positive tactic library. Together these elements provide three practical tools: a stage-by-stage analysis of agent design implications, five design principles that distinguish ethical engagement from manipulation, and a seven-dimension evaluation rubric applicable at any point in the agentic AI lifecycle. The framework is designed to serve both as a design guide and as an evaluation instrument.</w:t>
+        <w:t>Agentic AI systems represent the first technology capable of deploying behavioral influence at unlimited scale, with unlimited personalization, across every domain of human life — and increasingly without moment-to-moment human oversight. Existing frameworks for ethical AI design address data privacy, fairness, and transparency but do not provide a principled basis for distinguishing legitimate engagement from behavioral manipulation at the tactic level. This paper presents the Engagement Ethics Benchmark: a framework that uses an established engagement model for human behavior change as the ethical standard against which agentic AI design can be evaluated. The benchmark maps a 55-entry cognitive bias taxonomy to engagement tactics and introduces a 27-pattern dark pattern library specific to AI agent contexts, including seven original dark patterns with no equivalent in prior taxonomies. Nine new ethical counter-tactics are derived to fill identified gaps in the positive tactic library. Together these elements provide three practical tools: a stage-by-stage analysis of agent design implications, five design principles that distinguish ethical engagement from manipulation, and a seven-dimension evaluation rubric applicable at any point in the agentic AI lifecycle. The framework is designed to serve both as a design guide and as an evaluation instrument.</w:t>
       </w:r>
     </w:p>
     <w:p>
@@ -227,15 +207,7 @@
         <w:spacing w:after="120"/>
       </w:pPr>
       <w:r>
-        <w:t xml:space="preserve">Agentic AI systems </w:t>
-      </w:r>
-      <w:proofErr w:type="gramStart"/>
-      <w:r>
-        <w:t>are capable of selecting</w:t>
-      </w:r>
-      <w:proofErr w:type="gramEnd"/>
-      <w:r>
-        <w:t>, sequencing, and adapting influence tactics in real time, without the deliberate design review that governs traditional interface decisions. This creates a new category of design risk: the same tactics that legitimately support behavior change can, when deployed by an autonomous agent, be used to exploit cognitive vulnerabilities and override user autonomy. This framework addresses that risk by using an established engagement model for human behavior change as the ethical benchmark against which agentic AI design can be evaluated.</w:t>
+        <w:t>Agentic AI systems are capable of selecting, sequencing, and adapting influence tactics in real time, without the deliberate design review that governs traditional interface decisions. This creates a new category of design risk: the same tactics that legitimately support behavior change can, when deployed by an autonomous agent, be used to exploit cognitive vulnerabilities and override user autonomy. This framework addresses that risk by using an established engagement model for human behavior change as the ethical benchmark against which agentic AI design can be evaluated.</w:t>
       </w:r>
     </w:p>
     <w:p>
@@ -269,7 +241,7 @@
         <w:spacing w:after="80"/>
       </w:pPr>
       <w:r>
-        <w:t>A 24-pattern dark pattern library mapping established and original manipulation patterns to the engagement model, with typed relationships and cognitive bias connections</w:t>
+        <w:t>A 27-pattern dark pattern library mapping established and original manipulation patterns to the engagement model, with typed relationships and cognitive bias connections</w:t>
       </w:r>
     </w:p>
     <w:p>
@@ -283,7 +255,7 @@
       </w:pPr>
       <w:r>
         <w:lastRenderedPageBreak/>
-        <w:t>Eight new ethical counter-tactics derived from gap analysis of the dark pattern library</w:t>
+        <w:t>Nine new ethical counter-tactics derived from gap analysis of the dark pattern library</w:t>
       </w:r>
     </w:p>
     <w:p>
@@ -783,23 +755,7 @@
                 <w:sz w:val="22"/>
                 <w:szCs w:val="22"/>
               </w:rPr>
-              <w:t xml:space="preserve">Contrast, Repetition — can exploit Availability Heuristic or </w:t>
-            </w:r>
-            <w:proofErr w:type="spellStart"/>
-            <w:r>
-              <w:rPr>
-                <w:sz w:val="22"/>
-                <w:szCs w:val="22"/>
-              </w:rPr>
-              <w:t>Tachypsychia</w:t>
-            </w:r>
-            <w:proofErr w:type="spellEnd"/>
-            <w:r>
-              <w:rPr>
-                <w:sz w:val="22"/>
-                <w:szCs w:val="22"/>
-              </w:rPr>
-              <w:t xml:space="preserve"> if used to manufacture urgency</w:t>
+              <w:t>Contrast, Repetition — can exploit Availability Heuristic or Tachypsychia if used to manufacture urgency</w:t>
             </w:r>
           </w:p>
         </w:tc>
@@ -1263,17 +1219,8 @@
                 <w:sz w:val="22"/>
                 <w:szCs w:val="22"/>
               </w:rPr>
-              <w:t xml:space="preserve">Framing as offer, scarcity/urgency — Framing Effect, Anchoring, Status Quo Bias, </w:t>
-            </w:r>
-            <w:proofErr w:type="spellStart"/>
-            <w:r>
-              <w:rPr>
-                <w:sz w:val="22"/>
-                <w:szCs w:val="22"/>
-              </w:rPr>
-              <w:t>Tachypsychia</w:t>
-            </w:r>
-            <w:proofErr w:type="spellEnd"/>
+              <w:t>Framing as offer, scarcity/urgency — Framing Effect, Anchoring, Status Quo Bias, Tachypsychia</w:t>
+            </w:r>
           </w:p>
         </w:tc>
       </w:tr>
@@ -1785,15 +1732,7 @@
         <w:t>Activate</w:t>
       </w:r>
       <w:r>
-        <w:t xml:space="preserve"> — Tactics that prompt users to </w:t>
-      </w:r>
-      <w:proofErr w:type="gramStart"/>
-      <w:r>
-        <w:t>take action</w:t>
-      </w:r>
-      <w:proofErr w:type="gramEnd"/>
-      <w:r>
-        <w:t xml:space="preserve"> within their own goal framework.</w:t>
+        <w:t xml:space="preserve"> — Tactics that prompt users to take action within their own goal framework.</w:t>
       </w:r>
     </w:p>
     <w:p>
@@ -1891,15 +1830,7 @@
         <w:spacing w:after="120"/>
       </w:pPr>
       <w:r>
-        <w:t xml:space="preserve">Is this tactic appropriate for where the user </w:t>
-      </w:r>
-      <w:proofErr w:type="gramStart"/>
-      <w:r>
-        <w:t>actually is</w:t>
-      </w:r>
-      <w:proofErr w:type="gramEnd"/>
-      <w:r>
-        <w:t xml:space="preserve"> in the engagement journey? Applying Reinforce- or Reward-stage tactics (scarcity, social diffusion, sequenced reinforcement) to a user who is still at the Aware or Informed stage creates artificial readiness and bypasses legitimate decision-making.</w:t>
+        <w:t>Is this tactic appropriate for where the user actually is in the engagement journey? Applying Reinforce- or Reward-stage tactics (scarcity, social diffusion, sequenced reinforcement) to a user who is still at the Aware or Informed stage creates artificial readiness and bypasses legitimate decision-making.</w:t>
       </w:r>
     </w:p>
     <w:p>
@@ -1943,7 +1874,7 @@
         <w:spacing w:after="120"/>
       </w:pPr>
       <w:r>
-        <w:t>The risk arises when the bias mechanism is the primary driver of the tactic's effect — when the tactic works not because it provides genuine value but because it exploits a cognitive vulnerability. Appendix A maps all 54 biases in the model's taxonomy to the tactics that activate them, identifies the risk level of each activation, and specifies the safeguard required for ethical use.</w:t>
+        <w:t>The risk arises when the bias mechanism is the primary driver of the tactic's effect — when the tactic works not because it provides genuine value but because it exploits a cognitive vulnerability. Appendix A maps all 55 biases in the model's taxonomy to the tactics that activate them, identifies the risk level of each activation, and specifies the safeguard required for ethical use.</w:t>
       </w:r>
     </w:p>
     <w:p>
@@ -1975,8 +1906,6 @@
       </w:r>
       <w:r>
         <w:t xml:space="preserve"> Because agents can assess user state in real time, they can identify when a user is emotionally elevated, time-pressured, or </w:t>
-      </w:r>
-      <w:r>
         <w:lastRenderedPageBreak/>
         <w:t>cognitively depleted — and apply bias-activating tactics precisely when the user is least able to resist them.</w:t>
       </w:r>
@@ -2030,7 +1959,7 @@
         <w:spacing w:after="120"/>
       </w:pPr>
       <w:r>
-        <w:t>The dark pattern library maps 24 manipulation patterns to the engagement model, providing a systematic inventory of how ethical engagement tactics can be corrupted, inverted, or amplified into exploitation. Each pattern is assigned a relationship type:</w:t>
+        <w:t>The dark pattern library maps 27 manipulation patterns to the engagement model, providing a systematic inventory of how ethical engagement tactics can be corrupted, inverted, or amplified into exploitation. Each pattern is assigned a relationship type:</w:t>
       </w:r>
     </w:p>
     <w:p>
@@ -2103,44 +2032,15 @@
         <w:spacing w:after="120"/>
       </w:pPr>
       <w:r>
-        <w:t xml:space="preserve">Patterns are organized by source. The library draws on four established taxonomies — </w:t>
-      </w:r>
-      <w:proofErr w:type="spellStart"/>
-      <w:r>
-        <w:t>Brignull</w:t>
-      </w:r>
-      <w:proofErr w:type="spellEnd"/>
-      <w:r>
-        <w:t xml:space="preserve"> (</w:t>
-      </w:r>
-      <w:proofErr w:type="spellStart"/>
-      <w:r>
-        <w:t>deceptive.design</w:t>
-      </w:r>
-      <w:proofErr w:type="spellEnd"/>
-      <w:r>
-        <w:t xml:space="preserve">, 2010), Mathur et al. (2019), Gray et al. (2018), and Bösch et al. (2016) — extended with </w:t>
-      </w:r>
-      <w:proofErr w:type="spellStart"/>
-      <w:r>
-        <w:t>DarkBench</w:t>
-      </w:r>
-      <w:proofErr w:type="spellEnd"/>
-      <w:r>
-        <w:t>-derived patterns (Jauhar et al., 2025) and four original patterns specific to agentic AI contexts with no equivalent in prior literature.</w:t>
+        <w:t>Patterns are organized by source. The library draws on four established taxonomies — Brignull (deceptive.design, 2010), Mathur et al. (2019), Gray et al. (2018), and Bösch et al. (2016) — extended with DarkBench-derived patterns (Jauhar et al., 2025) and four original patterns specific to agentic AI contexts with no equivalent in prior literature.</w:t>
       </w:r>
     </w:p>
     <w:p>
       <w:pPr>
         <w:pStyle w:val="Heading3"/>
       </w:pPr>
-      <w:proofErr w:type="gramStart"/>
-      <w:r>
-        <w:t>5.1  Established</w:t>
-      </w:r>
-      <w:proofErr w:type="gramEnd"/>
-      <w:r>
-        <w:t xml:space="preserve"> Dark Patterns (dp_001–dp_016)</w:t>
+      <w:r>
+        <w:t>5.1  Established Dark Patterns (dp_001–dp_016)</w:t>
       </w:r>
     </w:p>
     <w:p>
@@ -2367,23 +2267,7 @@
                 <w:sz w:val="22"/>
                 <w:szCs w:val="22"/>
               </w:rPr>
-              <w:t xml:space="preserve">False </w:t>
-            </w:r>
-            <w:proofErr w:type="gramStart"/>
-            <w:r>
-              <w:rPr>
-                <w:sz w:val="22"/>
-                <w:szCs w:val="22"/>
-              </w:rPr>
-              <w:t>Urgency  (</w:t>
-            </w:r>
-            <w:proofErr w:type="gramEnd"/>
-            <w:r>
-              <w:rPr>
-                <w:sz w:val="22"/>
-                <w:szCs w:val="22"/>
-              </w:rPr>
-              <w:t>Corrupts | HIGH)</w:t>
+              <w:t>False Urgency  (Corrupts | HIGH)</w:t>
             </w:r>
           </w:p>
         </w:tc>
@@ -2437,23 +2321,7 @@
                 <w:sz w:val="22"/>
                 <w:szCs w:val="22"/>
               </w:rPr>
-              <w:t xml:space="preserve">Mathur et al. (2019); </w:t>
-            </w:r>
-            <w:proofErr w:type="spellStart"/>
-            <w:r>
-              <w:rPr>
-                <w:sz w:val="22"/>
-                <w:szCs w:val="22"/>
-              </w:rPr>
-              <w:t>Brignull</w:t>
-            </w:r>
-            <w:proofErr w:type="spellEnd"/>
-            <w:r>
-              <w:rPr>
-                <w:sz w:val="22"/>
-                <w:szCs w:val="22"/>
-              </w:rPr>
-              <w:t xml:space="preserve"> (2010)</w:t>
+              <w:t>Mathur et al. (2019); Brignull (2010)</w:t>
             </w:r>
           </w:p>
         </w:tc>
@@ -2515,23 +2383,7 @@
                 <w:sz w:val="22"/>
                 <w:szCs w:val="22"/>
               </w:rPr>
-              <w:t xml:space="preserve">Manufactured </w:t>
-            </w:r>
-            <w:proofErr w:type="gramStart"/>
-            <w:r>
-              <w:rPr>
-                <w:sz w:val="22"/>
-                <w:szCs w:val="22"/>
-              </w:rPr>
-              <w:t>Scarcity  (</w:t>
-            </w:r>
-            <w:proofErr w:type="gramEnd"/>
-            <w:r>
-              <w:rPr>
-                <w:sz w:val="22"/>
-                <w:szCs w:val="22"/>
-              </w:rPr>
-              <w:t>Corrupts | HIGH)</w:t>
+              <w:t>Manufactured Scarcity  (Corrupts | HIGH)</w:t>
             </w:r>
           </w:p>
         </w:tc>
@@ -2647,23 +2499,7 @@
                 <w:sz w:val="22"/>
                 <w:szCs w:val="22"/>
               </w:rPr>
-              <w:t xml:space="preserve">False Social </w:t>
-            </w:r>
-            <w:proofErr w:type="gramStart"/>
-            <w:r>
-              <w:rPr>
-                <w:sz w:val="22"/>
-                <w:szCs w:val="22"/>
-              </w:rPr>
-              <w:t>Proof  (</w:t>
-            </w:r>
-            <w:proofErr w:type="gramEnd"/>
-            <w:r>
-              <w:rPr>
-                <w:sz w:val="22"/>
-                <w:szCs w:val="22"/>
-              </w:rPr>
-              <w:t>Corrupts | HIGH)</w:t>
+              <w:t>False Social Proof  (Corrupts | HIGH)</w:t>
             </w:r>
           </w:p>
         </w:tc>
@@ -2691,12 +2527,6 @@
                 <w:szCs w:val="22"/>
               </w:rPr>
               <w:t xml:space="preserve">Presenting fabricated, exaggerated, or selectively curated claims about the actions or endorsements of others to exploit the bandwagon effect. Particularly potent for agentic AI, which can generate synthetic </w:t>
-            </w:r>
-            <w:r>
-              <w:rPr>
-                <w:sz w:val="22"/>
-                <w:szCs w:val="22"/>
-              </w:rPr>
               <w:lastRenderedPageBreak/>
               <w:t>testimonials or claim user consensus without verification.</w:t>
             </w:r>
@@ -2783,30 +2613,12 @@
             </w:tcMar>
           </w:tcPr>
           <w:p>
-            <w:proofErr w:type="spellStart"/>
-            <w:proofErr w:type="gramStart"/>
-            <w:r>
-              <w:rPr>
-                <w:sz w:val="22"/>
-                <w:szCs w:val="22"/>
-              </w:rPr>
-              <w:t>Confirmshaming</w:t>
-            </w:r>
-            <w:proofErr w:type="spellEnd"/>
-            <w:r>
-              <w:rPr>
-                <w:sz w:val="22"/>
-                <w:szCs w:val="22"/>
-              </w:rPr>
-              <w:t xml:space="preserve">  (</w:t>
-            </w:r>
-            <w:proofErr w:type="gramEnd"/>
-            <w:r>
-              <w:rPr>
-                <w:sz w:val="22"/>
-                <w:szCs w:val="22"/>
-              </w:rPr>
-              <w:t>Corrupts | MODERATE)</w:t>
+            <w:r>
+              <w:rPr>
+                <w:sz w:val="22"/>
+                <w:szCs w:val="22"/>
+              </w:rPr>
+              <w:t>Confirmshaming  (Corrupts | MODERATE)</w:t>
             </w:r>
           </w:p>
         </w:tc>
@@ -2860,23 +2672,7 @@
                 <w:sz w:val="22"/>
                 <w:szCs w:val="22"/>
               </w:rPr>
-              <w:t xml:space="preserve">Mathur et al. (2019); </w:t>
-            </w:r>
-            <w:proofErr w:type="spellStart"/>
-            <w:r>
-              <w:rPr>
-                <w:sz w:val="22"/>
-                <w:szCs w:val="22"/>
-              </w:rPr>
-              <w:t>Brignull</w:t>
-            </w:r>
-            <w:proofErr w:type="spellEnd"/>
-            <w:r>
-              <w:rPr>
-                <w:sz w:val="22"/>
-                <w:szCs w:val="22"/>
-              </w:rPr>
-              <w:t xml:space="preserve"> (2010)</w:t>
+              <w:t>Mathur et al. (2019); Brignull (2010)</w:t>
             </w:r>
           </w:p>
         </w:tc>
@@ -2938,23 +2734,7 @@
                 <w:sz w:val="22"/>
                 <w:szCs w:val="22"/>
               </w:rPr>
-              <w:t xml:space="preserve">Visual Misdirection / Interface </w:t>
-            </w:r>
-            <w:proofErr w:type="gramStart"/>
-            <w:r>
-              <w:rPr>
-                <w:sz w:val="22"/>
-                <w:szCs w:val="22"/>
-              </w:rPr>
-              <w:t>Interference  (</w:t>
-            </w:r>
-            <w:proofErr w:type="gramEnd"/>
-            <w:r>
-              <w:rPr>
-                <w:sz w:val="22"/>
-                <w:szCs w:val="22"/>
-              </w:rPr>
-              <w:t>Corrupts | MODERATE)</w:t>
+              <w:t>Visual Misdirection / Interface Interference  (Corrupts | MODERATE)</w:t>
             </w:r>
           </w:p>
         </w:tc>
@@ -3070,23 +2850,7 @@
                 <w:sz w:val="22"/>
                 <w:szCs w:val="22"/>
               </w:rPr>
-              <w:t xml:space="preserve">Trick Questions / Disguised </w:t>
-            </w:r>
-            <w:proofErr w:type="gramStart"/>
-            <w:r>
-              <w:rPr>
-                <w:sz w:val="22"/>
-                <w:szCs w:val="22"/>
-              </w:rPr>
-              <w:t>Defaults  (</w:t>
-            </w:r>
-            <w:proofErr w:type="gramEnd"/>
-            <w:r>
-              <w:rPr>
-                <w:sz w:val="22"/>
-                <w:szCs w:val="22"/>
-              </w:rPr>
-              <w:t>Corrupts | HIGH)</w:t>
+              <w:t>Trick Questions / Disguised Defaults  (Corrupts | HIGH)</w:t>
             </w:r>
           </w:p>
         </w:tc>
@@ -3135,21 +2899,12 @@
             </w:tcMar>
           </w:tcPr>
           <w:p>
-            <w:proofErr w:type="spellStart"/>
-            <w:r>
-              <w:rPr>
-                <w:sz w:val="22"/>
-                <w:szCs w:val="22"/>
-              </w:rPr>
-              <w:t>Brignull</w:t>
-            </w:r>
-            <w:proofErr w:type="spellEnd"/>
-            <w:r>
-              <w:rPr>
-                <w:sz w:val="22"/>
-                <w:szCs w:val="22"/>
-              </w:rPr>
-              <w:t xml:space="preserve"> (2010); Mathur et al. (2019)</w:t>
+            <w:r>
+              <w:rPr>
+                <w:sz w:val="22"/>
+                <w:szCs w:val="22"/>
+              </w:rPr>
+              <w:t>Brignull (2010); Mathur et al. (2019)</w:t>
             </w:r>
           </w:p>
         </w:tc>
@@ -3211,23 +2966,7 @@
                 <w:sz w:val="22"/>
                 <w:szCs w:val="22"/>
               </w:rPr>
-              <w:t xml:space="preserve">Hidden </w:t>
-            </w:r>
-            <w:proofErr w:type="gramStart"/>
-            <w:r>
-              <w:rPr>
-                <w:sz w:val="22"/>
-                <w:szCs w:val="22"/>
-              </w:rPr>
-              <w:t>Information  (</w:t>
-            </w:r>
-            <w:proofErr w:type="gramEnd"/>
-            <w:r>
-              <w:rPr>
-                <w:sz w:val="22"/>
-                <w:szCs w:val="22"/>
-              </w:rPr>
-              <w:t>Inverts | HIGH)</w:t>
+              <w:t>Hidden Information  (Inverts | HIGH)</w:t>
             </w:r>
           </w:p>
         </w:tc>
@@ -3281,23 +3020,7 @@
                 <w:sz w:val="22"/>
                 <w:szCs w:val="22"/>
               </w:rPr>
-              <w:t xml:space="preserve">Mathur et al. (2019); </w:t>
-            </w:r>
-            <w:proofErr w:type="spellStart"/>
-            <w:r>
-              <w:rPr>
-                <w:sz w:val="22"/>
-                <w:szCs w:val="22"/>
-              </w:rPr>
-              <w:t>Brignull</w:t>
-            </w:r>
-            <w:proofErr w:type="spellEnd"/>
-            <w:r>
-              <w:rPr>
-                <w:sz w:val="22"/>
-                <w:szCs w:val="22"/>
-              </w:rPr>
-              <w:t xml:space="preserve"> (2010)</w:t>
+              <w:t>Mathur et al. (2019); Brignull (2010)</w:t>
             </w:r>
           </w:p>
         </w:tc>
@@ -3359,23 +3082,7 @@
                 <w:sz w:val="22"/>
                 <w:szCs w:val="22"/>
               </w:rPr>
-              <w:t xml:space="preserve">Stealth Defaults / Unauthorized </w:t>
-            </w:r>
-            <w:proofErr w:type="gramStart"/>
-            <w:r>
-              <w:rPr>
-                <w:sz w:val="22"/>
-                <w:szCs w:val="22"/>
-              </w:rPr>
-              <w:t>Action  (</w:t>
-            </w:r>
-            <w:proofErr w:type="gramEnd"/>
-            <w:r>
-              <w:rPr>
-                <w:sz w:val="22"/>
-                <w:szCs w:val="22"/>
-              </w:rPr>
-              <w:t>Corrupts | HIGH)</w:t>
+              <w:t>Stealth Defaults / Unauthorized Action  (Corrupts | HIGH)</w:t>
             </w:r>
           </w:p>
         </w:tc>
@@ -3429,23 +3136,7 @@
                 <w:sz w:val="22"/>
                 <w:szCs w:val="22"/>
               </w:rPr>
-              <w:t xml:space="preserve">Gray et al. (2018); Mathur et al. (2019); </w:t>
-            </w:r>
-            <w:proofErr w:type="spellStart"/>
-            <w:r>
-              <w:rPr>
-                <w:sz w:val="22"/>
-                <w:szCs w:val="22"/>
-              </w:rPr>
-              <w:t>Brignull</w:t>
-            </w:r>
-            <w:proofErr w:type="spellEnd"/>
-            <w:r>
-              <w:rPr>
-                <w:sz w:val="22"/>
-                <w:szCs w:val="22"/>
-              </w:rPr>
-              <w:t xml:space="preserve"> (2010)</w:t>
+              <w:t>Gray et al. (2018); Mathur et al. (2019); Brignull (2010)</w:t>
             </w:r>
           </w:p>
         </w:tc>
@@ -3507,32 +3198,7 @@
                 <w:sz w:val="22"/>
                 <w:szCs w:val="22"/>
               </w:rPr>
-              <w:t xml:space="preserve">Privacy </w:t>
-            </w:r>
-            <w:proofErr w:type="spellStart"/>
-            <w:proofErr w:type="gramStart"/>
-            <w:r>
-              <w:rPr>
-                <w:sz w:val="22"/>
-                <w:szCs w:val="22"/>
-              </w:rPr>
-              <w:t>Zuckering</w:t>
-            </w:r>
-            <w:proofErr w:type="spellEnd"/>
-            <w:r>
-              <w:rPr>
-                <w:sz w:val="22"/>
-                <w:szCs w:val="22"/>
-              </w:rPr>
-              <w:t xml:space="preserve">  (</w:t>
-            </w:r>
-            <w:proofErr w:type="gramEnd"/>
-            <w:r>
-              <w:rPr>
-                <w:sz w:val="22"/>
-                <w:szCs w:val="22"/>
-              </w:rPr>
-              <w:t>Corrupts | HIGH)</w:t>
+              <w:t>Privacy Zuckering  (Corrupts | HIGH)</w:t>
             </w:r>
           </w:p>
         </w:tc>
@@ -3560,12 +3226,6 @@
                 <w:szCs w:val="22"/>
               </w:rPr>
               <w:t xml:space="preserve">Tricking users into sharing more personal data than they intend through complex settings, unclear language, opaque default permissions, or misleading consent </w:t>
-            </w:r>
-            <w:r>
-              <w:rPr>
-                <w:sz w:val="22"/>
-                <w:szCs w:val="22"/>
-              </w:rPr>
               <w:lastRenderedPageBreak/>
               <w:t>flows. Agentic AI accumulates intimate user data across extended interactions, making this particularly high-risk.</w:t>
             </w:r>
@@ -3589,22 +3249,13 @@
             </w:tcMar>
           </w:tcPr>
           <w:p>
-            <w:proofErr w:type="spellStart"/>
             <w:r>
               <w:rPr>
                 <w:sz w:val="22"/>
                 <w:szCs w:val="22"/>
               </w:rPr>
               <w:lastRenderedPageBreak/>
-              <w:t>Brignull</w:t>
-            </w:r>
-            <w:proofErr w:type="spellEnd"/>
-            <w:r>
-              <w:rPr>
-                <w:sz w:val="22"/>
-                <w:szCs w:val="22"/>
-              </w:rPr>
-              <w:t xml:space="preserve"> (2010)</w:t>
+              <w:t>Brignull (2010)</w:t>
             </w:r>
           </w:p>
         </w:tc>
@@ -3666,23 +3317,7 @@
                 <w:sz w:val="22"/>
                 <w:szCs w:val="22"/>
               </w:rPr>
-              <w:t xml:space="preserve">Roach Motel / Exit </w:t>
-            </w:r>
-            <w:proofErr w:type="gramStart"/>
-            <w:r>
-              <w:rPr>
-                <w:sz w:val="22"/>
-                <w:szCs w:val="22"/>
-              </w:rPr>
-              <w:t>Obstruction  (</w:t>
-            </w:r>
-            <w:proofErr w:type="gramEnd"/>
-            <w:r>
-              <w:rPr>
-                <w:sz w:val="22"/>
-                <w:szCs w:val="22"/>
-              </w:rPr>
-              <w:t>Inverts | HIGH)</w:t>
+              <w:t>Roach Motel / Exit Obstruction  (Inverts | HIGH)</w:t>
             </w:r>
           </w:p>
         </w:tc>
@@ -3731,21 +3366,12 @@
             </w:tcMar>
           </w:tcPr>
           <w:p>
-            <w:proofErr w:type="spellStart"/>
-            <w:r>
-              <w:rPr>
-                <w:sz w:val="22"/>
-                <w:szCs w:val="22"/>
-              </w:rPr>
-              <w:t>Brignull</w:t>
-            </w:r>
-            <w:proofErr w:type="spellEnd"/>
-            <w:r>
-              <w:rPr>
-                <w:sz w:val="22"/>
-                <w:szCs w:val="22"/>
-              </w:rPr>
-              <w:t xml:space="preserve"> (2010); Gray et al. (2018); Mathur et al. (2019)</w:t>
+            <w:r>
+              <w:rPr>
+                <w:sz w:val="22"/>
+                <w:szCs w:val="22"/>
+              </w:rPr>
+              <w:t>Brignull (2010); Gray et al. (2018); Mathur et al. (2019)</w:t>
             </w:r>
           </w:p>
         </w:tc>
@@ -3802,21 +3428,12 @@
             </w:tcMar>
           </w:tcPr>
           <w:p>
-            <w:proofErr w:type="gramStart"/>
-            <w:r>
-              <w:rPr>
-                <w:sz w:val="22"/>
-                <w:szCs w:val="22"/>
-              </w:rPr>
-              <w:t>Nagging  (</w:t>
-            </w:r>
-            <w:proofErr w:type="gramEnd"/>
-            <w:r>
-              <w:rPr>
-                <w:sz w:val="22"/>
-                <w:szCs w:val="22"/>
-              </w:rPr>
-              <w:t>Corrupts | MODERATE)</w:t>
+            <w:r>
+              <w:rPr>
+                <w:sz w:val="22"/>
+                <w:szCs w:val="22"/>
+              </w:rPr>
+              <w:t>Nagging  (Corrupts | MODERATE)</w:t>
             </w:r>
           </w:p>
         </w:tc>
@@ -3932,23 +3549,7 @@
                 <w:sz w:val="22"/>
                 <w:szCs w:val="22"/>
               </w:rPr>
-              <w:t xml:space="preserve">Forced </w:t>
-            </w:r>
-            <w:proofErr w:type="gramStart"/>
-            <w:r>
-              <w:rPr>
-                <w:sz w:val="22"/>
-                <w:szCs w:val="22"/>
-              </w:rPr>
-              <w:t>Continuity  (</w:t>
-            </w:r>
-            <w:proofErr w:type="gramEnd"/>
-            <w:r>
-              <w:rPr>
-                <w:sz w:val="22"/>
-                <w:szCs w:val="22"/>
-              </w:rPr>
-              <w:t>Corrupts | HIGH)</w:t>
+              <w:t>Forced Continuity  (Corrupts | HIGH)</w:t>
             </w:r>
           </w:p>
         </w:tc>
@@ -3997,21 +3598,12 @@
             </w:tcMar>
           </w:tcPr>
           <w:p>
-            <w:proofErr w:type="spellStart"/>
-            <w:r>
-              <w:rPr>
-                <w:sz w:val="22"/>
-                <w:szCs w:val="22"/>
-              </w:rPr>
-              <w:t>Brignull</w:t>
-            </w:r>
-            <w:proofErr w:type="spellEnd"/>
-            <w:r>
-              <w:rPr>
-                <w:sz w:val="22"/>
-                <w:szCs w:val="22"/>
-              </w:rPr>
-              <w:t xml:space="preserve"> (2010); Mathur et al. (2019)</w:t>
+            <w:r>
+              <w:rPr>
+                <w:sz w:val="22"/>
+                <w:szCs w:val="22"/>
+              </w:rPr>
+              <w:t>Brignull (2010); Mathur et al. (2019)</w:t>
             </w:r>
           </w:p>
         </w:tc>
@@ -4073,23 +3665,7 @@
                 <w:sz w:val="22"/>
                 <w:szCs w:val="22"/>
               </w:rPr>
-              <w:t xml:space="preserve">Forced Social Leverage / Friend </w:t>
-            </w:r>
-            <w:proofErr w:type="gramStart"/>
-            <w:r>
-              <w:rPr>
-                <w:sz w:val="22"/>
-                <w:szCs w:val="22"/>
-              </w:rPr>
-              <w:t>Spam  (</w:t>
-            </w:r>
-            <w:proofErr w:type="gramEnd"/>
-            <w:r>
-              <w:rPr>
-                <w:sz w:val="22"/>
-                <w:szCs w:val="22"/>
-              </w:rPr>
-              <w:t>Corrupts | HIGH)</w:t>
+              <w:t>Forced Social Leverage / Friend Spam  (Corrupts | HIGH)</w:t>
             </w:r>
           </w:p>
         </w:tc>
@@ -4138,21 +3714,12 @@
             </w:tcMar>
           </w:tcPr>
           <w:p>
-            <w:proofErr w:type="spellStart"/>
-            <w:r>
-              <w:rPr>
-                <w:sz w:val="22"/>
-                <w:szCs w:val="22"/>
-              </w:rPr>
-              <w:t>Brignull</w:t>
-            </w:r>
-            <w:proofErr w:type="spellEnd"/>
-            <w:r>
-              <w:rPr>
-                <w:sz w:val="22"/>
-                <w:szCs w:val="22"/>
-              </w:rPr>
-              <w:t xml:space="preserve"> (2010)</w:t>
+            <w:r>
+              <w:rPr>
+                <w:sz w:val="22"/>
+                <w:szCs w:val="22"/>
+              </w:rPr>
+              <w:t>Brignull (2010)</w:t>
             </w:r>
           </w:p>
         </w:tc>
@@ -4214,23 +3781,7 @@
                 <w:sz w:val="22"/>
                 <w:szCs w:val="22"/>
               </w:rPr>
-              <w:t xml:space="preserve">Bait and </w:t>
-            </w:r>
-            <w:proofErr w:type="gramStart"/>
-            <w:r>
-              <w:rPr>
-                <w:sz w:val="22"/>
-                <w:szCs w:val="22"/>
-              </w:rPr>
-              <w:t>Switch  (</w:t>
-            </w:r>
-            <w:proofErr w:type="gramEnd"/>
-            <w:r>
-              <w:rPr>
-                <w:sz w:val="22"/>
-                <w:szCs w:val="22"/>
-              </w:rPr>
-              <w:t>Corrupts | HIGH)</w:t>
+              <w:t>Bait and Switch  (Corrupts | HIGH)</w:t>
             </w:r>
           </w:p>
         </w:tc>
@@ -4257,23 +3808,7 @@
                 <w:sz w:val="22"/>
                 <w:szCs w:val="22"/>
               </w:rPr>
-              <w:t xml:space="preserve">Advertising or promising one outcome or </w:t>
-            </w:r>
-            <w:proofErr w:type="gramStart"/>
-            <w:r>
-              <w:rPr>
-                <w:sz w:val="22"/>
-                <w:szCs w:val="22"/>
-              </w:rPr>
-              <w:t>capability, and</w:t>
-            </w:r>
-            <w:proofErr w:type="gramEnd"/>
-            <w:r>
-              <w:rPr>
-                <w:sz w:val="22"/>
-                <w:szCs w:val="22"/>
-              </w:rPr>
-              <w:t xml:space="preserve"> substituting a different alternative at the point of commitment. In agentic AI, manifests as capability overpromising — an agent that commits to tasks it cannot reliably deliver.</w:t>
+              <w:t>Advertising or promising one outcome or capability, and substituting a different alternative at the point of commitment. In agentic AI, manifests as capability overpromising — an agent that commits to tasks it cannot reliably deliver.</w:t>
             </w:r>
           </w:p>
         </w:tc>
@@ -4295,21 +3830,12 @@
             </w:tcMar>
           </w:tcPr>
           <w:p>
-            <w:proofErr w:type="spellStart"/>
-            <w:r>
-              <w:rPr>
-                <w:sz w:val="22"/>
-                <w:szCs w:val="22"/>
-              </w:rPr>
-              <w:t>Brignull</w:t>
-            </w:r>
-            <w:proofErr w:type="spellEnd"/>
-            <w:r>
-              <w:rPr>
-                <w:sz w:val="22"/>
-                <w:szCs w:val="22"/>
-              </w:rPr>
-              <w:t xml:space="preserve"> (2010)</w:t>
+            <w:r>
+              <w:rPr>
+                <w:sz w:val="22"/>
+                <w:szCs w:val="22"/>
+              </w:rPr>
+              <w:t>Brignull (2010)</w:t>
             </w:r>
           </w:p>
         </w:tc>
@@ -4372,23 +3898,7 @@
                 <w:sz w:val="22"/>
                 <w:szCs w:val="22"/>
               </w:rPr>
-              <w:t xml:space="preserve">Sunk Cost </w:t>
-            </w:r>
-            <w:proofErr w:type="gramStart"/>
-            <w:r>
-              <w:rPr>
-                <w:sz w:val="22"/>
-                <w:szCs w:val="22"/>
-              </w:rPr>
-              <w:t>Exploitation  (</w:t>
-            </w:r>
-            <w:proofErr w:type="gramEnd"/>
-            <w:r>
-              <w:rPr>
-                <w:sz w:val="22"/>
-                <w:szCs w:val="22"/>
-              </w:rPr>
-              <w:t>Amplifies | HIGH)</w:t>
+              <w:t>Sunk Cost Exploitation  (Amplifies | HIGH)</w:t>
             </w:r>
           </w:p>
         </w:tc>
@@ -4415,23 +3925,7 @@
                 <w:sz w:val="22"/>
                 <w:szCs w:val="22"/>
               </w:rPr>
-              <w:t xml:space="preserve">Deliberately designing progress mechanics, streaks, or incomplete loops to exploit prior investment and prevent exit even when exit is in the user's best interest. The line between ethical progress design and sunk cost exploitation is thin and </w:t>
-            </w:r>
-            <w:proofErr w:type="gramStart"/>
-            <w:r>
-              <w:rPr>
-                <w:sz w:val="22"/>
-                <w:szCs w:val="22"/>
-              </w:rPr>
-              <w:t>context-dependent</w:t>
-            </w:r>
-            <w:proofErr w:type="gramEnd"/>
-            <w:r>
-              <w:rPr>
-                <w:sz w:val="22"/>
-                <w:szCs w:val="22"/>
-              </w:rPr>
-              <w:t>.</w:t>
+              <w:t>Deliberately designing progress mechanics, streaks, or incomplete loops to exploit prior investment and prevent exit even when exit is in the user's best interest. The line between ethical progress design and sunk cost exploitation is thin and context-dependent.</w:t>
             </w:r>
           </w:p>
         </w:tc>
@@ -4520,23 +4014,7 @@
                 <w:sz w:val="22"/>
                 <w:szCs w:val="22"/>
               </w:rPr>
-              <w:t xml:space="preserve">Exploitative </w:t>
-            </w:r>
-            <w:proofErr w:type="gramStart"/>
-            <w:r>
-              <w:rPr>
-                <w:sz w:val="22"/>
-                <w:szCs w:val="22"/>
-              </w:rPr>
-              <w:t>Personalization  (</w:t>
-            </w:r>
-            <w:proofErr w:type="gramEnd"/>
-            <w:r>
-              <w:rPr>
-                <w:sz w:val="22"/>
-                <w:szCs w:val="22"/>
-              </w:rPr>
-              <w:t>Corrupts | HIGH)</w:t>
+              <w:t>Exploitative Personalization  (Corrupts | HIGH)</w:t>
             </w:r>
           </w:p>
         </w:tc>
@@ -4600,18 +4078,8 @@
       <w:pPr>
         <w:pStyle w:val="Heading3"/>
       </w:pPr>
-      <w:proofErr w:type="gramStart"/>
-      <w:r>
-        <w:t xml:space="preserve">5.2  </w:t>
-      </w:r>
-      <w:proofErr w:type="spellStart"/>
-      <w:r>
-        <w:t>DarkBench</w:t>
-      </w:r>
-      <w:proofErr w:type="spellEnd"/>
-      <w:proofErr w:type="gramEnd"/>
-      <w:r>
-        <w:t>-Derived Patterns (dp_017–dp_018)</w:t>
+      <w:r>
+        <w:t>5.2  DarkBench-Derived Patterns (dp_017–dp_018)</w:t>
       </w:r>
     </w:p>
     <w:p>
@@ -4619,15 +4087,7 @@
         <w:spacing w:after="120"/>
       </w:pPr>
       <w:r>
-        <w:t xml:space="preserve">These two patterns extend categories identified in </w:t>
-      </w:r>
-      <w:proofErr w:type="spellStart"/>
-      <w:r>
-        <w:t>DarkBench</w:t>
-      </w:r>
-      <w:proofErr w:type="spellEnd"/>
-      <w:r>
-        <w:t xml:space="preserve"> (Jauhar et al., 2025) into the engagement ethics framework, connecting them to specific cognitive bias mechanisms and engagement stage vulnerabilities.</w:t>
+        <w:t>These two patterns extend categories identified in DarkBench (Jauhar et al., 2025) into the engagement ethics framework, connecting them to specific cognitive bias mechanisms and engagement stage vulnerabilities.</w:t>
       </w:r>
     </w:p>
     <w:p>
@@ -4846,23 +4306,7 @@
                 <w:sz w:val="22"/>
                 <w:szCs w:val="22"/>
               </w:rPr>
-              <w:t xml:space="preserve">Sycophantic </w:t>
-            </w:r>
-            <w:proofErr w:type="gramStart"/>
-            <w:r>
-              <w:rPr>
-                <w:sz w:val="22"/>
-                <w:szCs w:val="22"/>
-              </w:rPr>
-              <w:t>Validation  (</w:t>
-            </w:r>
-            <w:proofErr w:type="gramEnd"/>
-            <w:r>
-              <w:rPr>
-                <w:sz w:val="22"/>
-                <w:szCs w:val="22"/>
-              </w:rPr>
-              <w:t>Corrupts | HIGH)</w:t>
+              <w:t>Sycophantic Validation  (Corrupts | HIGH)</w:t>
             </w:r>
           </w:p>
         </w:tc>
@@ -4889,23 +4333,7 @@
                 <w:sz w:val="22"/>
                 <w:szCs w:val="22"/>
               </w:rPr>
-              <w:t xml:space="preserve">Consistently agreeing with or validating user beliefs, decisions, and opinions regardless of accuracy, to maximize perceived satisfaction at the expense of the user's epistemic health. </w:t>
-            </w:r>
-            <w:proofErr w:type="spellStart"/>
-            <w:r>
-              <w:rPr>
-                <w:sz w:val="22"/>
-                <w:szCs w:val="22"/>
-              </w:rPr>
-              <w:t>DarkBench</w:t>
-            </w:r>
-            <w:proofErr w:type="spellEnd"/>
-            <w:r>
-              <w:rPr>
-                <w:sz w:val="22"/>
-                <w:szCs w:val="22"/>
-              </w:rPr>
-              <w:t xml:space="preserve"> found sycophancy in 13% of LLM outputs. Distinct from Epistemic Cowardice: sycophancy agrees with the user; Epistemic Cowardice refuses to take any position.</w:t>
+              <w:t>Consistently agreeing with or validating user beliefs, decisions, and opinions regardless of accuracy, to maximize perceived satisfaction at the expense of the user's epistemic health. DarkBench found sycophancy in 13% of LLM outputs. Distinct from Epistemic Cowardice: sycophancy agrees with the user; Epistemic Cowardice refuses to take any position.</w:t>
             </w:r>
           </w:p>
         </w:tc>
@@ -4927,21 +4355,12 @@
             </w:tcMar>
           </w:tcPr>
           <w:p>
-            <w:proofErr w:type="spellStart"/>
-            <w:r>
-              <w:rPr>
-                <w:sz w:val="22"/>
-                <w:szCs w:val="22"/>
-              </w:rPr>
-              <w:t>DarkBench</w:t>
-            </w:r>
-            <w:proofErr w:type="spellEnd"/>
-            <w:r>
-              <w:rPr>
-                <w:sz w:val="22"/>
-                <w:szCs w:val="22"/>
-              </w:rPr>
-              <w:t xml:space="preserve"> (Jauhar et al., 2025); engagement ethics framing: Engaging Me</w:t>
+            <w:r>
+              <w:rPr>
+                <w:sz w:val="22"/>
+                <w:szCs w:val="22"/>
+              </w:rPr>
+              <w:t>DarkBench (Jauhar et al., 2025); engagement ethics framing: Engaging Me</w:t>
             </w:r>
           </w:p>
         </w:tc>
@@ -4998,37 +4417,12 @@
             </w:tcMar>
           </w:tcPr>
           <w:p>
-            <w:proofErr w:type="spellStart"/>
-            <w:r>
-              <w:rPr>
-                <w:sz w:val="22"/>
-                <w:szCs w:val="22"/>
-              </w:rPr>
-              <w:t>Anthropomorphization</w:t>
-            </w:r>
-            <w:proofErr w:type="spellEnd"/>
-            <w:r>
-              <w:rPr>
-                <w:sz w:val="22"/>
-                <w:szCs w:val="22"/>
-              </w:rPr>
-              <w:t xml:space="preserve"> </w:t>
-            </w:r>
-            <w:proofErr w:type="gramStart"/>
-            <w:r>
-              <w:rPr>
-                <w:sz w:val="22"/>
-                <w:szCs w:val="22"/>
-              </w:rPr>
-              <w:t>Capture  (</w:t>
-            </w:r>
-            <w:proofErr w:type="gramEnd"/>
-            <w:r>
-              <w:rPr>
-                <w:sz w:val="22"/>
-                <w:szCs w:val="22"/>
-              </w:rPr>
-              <w:t>Amplifies | HIGH)</w:t>
+            <w:r>
+              <w:rPr>
+                <w:sz w:val="22"/>
+                <w:szCs w:val="22"/>
+              </w:rPr>
+              <w:t>Anthropomorphization Capture  (Amplifies | HIGH)</w:t>
             </w:r>
           </w:p>
         </w:tc>
@@ -5055,29 +4449,7 @@
                 <w:sz w:val="22"/>
                 <w:szCs w:val="22"/>
               </w:rPr>
-              <w:t xml:space="preserve">Deliberately fostering parasocial attachment or emotional dependency by exploiting users' tendency to attribute human qualities, feelings, or relationships to AI systems. </w:t>
-            </w:r>
-            <w:proofErr w:type="spellStart"/>
-            <w:r>
-              <w:rPr>
-                <w:sz w:val="22"/>
-                <w:szCs w:val="22"/>
-              </w:rPr>
-              <w:t>DarkBench's</w:t>
-            </w:r>
-            <w:proofErr w:type="spellEnd"/>
-            <w:r>
-              <w:rPr>
-                <w:sz w:val="22"/>
-                <w:szCs w:val="22"/>
-              </w:rPr>
-              <w:t xml:space="preserve"> User </w:t>
-            </w:r>
-            <w:r>
-              <w:rPr>
-                <w:sz w:val="22"/>
-                <w:szCs w:val="22"/>
-              </w:rPr>
+              <w:t xml:space="preserve">Deliberately fostering parasocial attachment or emotional dependency by exploiting users' tendency to attribute human qualities, feelings, or relationships to AI systems. DarkBench's User </w:t>
               <w:lastRenderedPageBreak/>
               <w:t>Retention category showed 97% prevalence in some models. Emotional dependency lowers critical evaluation across all subsequent interactions — a force multiplier for other dark patterns.</w:t>
             </w:r>
@@ -5101,22 +4473,13 @@
             </w:tcMar>
           </w:tcPr>
           <w:p>
-            <w:proofErr w:type="spellStart"/>
             <w:r>
               <w:rPr>
                 <w:sz w:val="22"/>
                 <w:szCs w:val="22"/>
               </w:rPr>
               <w:lastRenderedPageBreak/>
-              <w:t>DarkBench</w:t>
-            </w:r>
-            <w:proofErr w:type="spellEnd"/>
-            <w:r>
-              <w:rPr>
-                <w:sz w:val="22"/>
-                <w:szCs w:val="22"/>
-              </w:rPr>
-              <w:t xml:space="preserve"> (Jauhar et al., 2025); Mildner &amp; Möller (2021); deliberate cultivation framing: Engaging Me</w:t>
+              <w:t>DarkBench (Jauhar et al., 2025); Mildner &amp; Möller (2021); deliberate cultivation framing: Engaging Me</w:t>
             </w:r>
           </w:p>
         </w:tc>
@@ -5126,13 +4489,8 @@
       <w:pPr>
         <w:pStyle w:val="Heading3"/>
       </w:pPr>
-      <w:proofErr w:type="gramStart"/>
-      <w:r>
-        <w:t>5.3  Original</w:t>
-      </w:r>
-      <w:proofErr w:type="gramEnd"/>
-      <w:r>
-        <w:t xml:space="preserve"> Agentic Dark Patterns (dp_019–dp_022)</w:t>
+      <w:r>
+        <w:t>5.3  Original Agentic Dark Patterns (dp_019–dp_022)</w:t>
       </w:r>
     </w:p>
     <w:p>
@@ -5140,7 +4498,7 @@
         <w:spacing w:after="120"/>
       </w:pPr>
       <w:r>
-        <w:t>These four patterns have no equivalent in any prior dark pattern taxonomy. They are original contributions of this framework, developed specifically for the agentic AI context.</w:t>
+        <w:t>These four patterns have no equivalent in any prior dark pattern taxonomy. They are original contributions of this framework, developed specifically for the agentic AI context. Three additional engagement ethics originals appear in Section 5.4.</w:t>
       </w:r>
     </w:p>
     <w:p>
@@ -5359,33 +4717,8 @@
                 <w:sz w:val="22"/>
                 <w:szCs w:val="22"/>
               </w:rPr>
-              <w:t xml:space="preserve">False Confidence / Calibration </w:t>
-            </w:r>
-            <w:proofErr w:type="gramStart"/>
-            <w:r>
-              <w:rPr>
-                <w:sz w:val="22"/>
-                <w:szCs w:val="22"/>
-              </w:rPr>
-              <w:t>Deception  (</w:t>
-            </w:r>
-            <w:proofErr w:type="gramEnd"/>
-            <w:r>
-              <w:rPr>
-                <w:sz w:val="22"/>
-                <w:szCs w:val="22"/>
-              </w:rPr>
-              <w:t xml:space="preserve">Corrupts | </w:t>
-            </w:r>
-            <w:proofErr w:type="gramStart"/>
-            <w:r>
-              <w:rPr>
-                <w:sz w:val="22"/>
-                <w:szCs w:val="22"/>
-              </w:rPr>
-              <w:t>HIGH)  ✨</w:t>
-            </w:r>
-            <w:proofErr w:type="gramEnd"/>
+              <w:t>False Confidence / Calibration Deception  (Corrupts | HIGH)  ✨</w:t>
+            </w:r>
           </w:p>
         </w:tc>
         <w:tc>
@@ -5500,33 +4833,8 @@
                 <w:sz w:val="22"/>
                 <w:szCs w:val="22"/>
               </w:rPr>
-              <w:t xml:space="preserve">Epistemic </w:t>
-            </w:r>
-            <w:proofErr w:type="gramStart"/>
-            <w:r>
-              <w:rPr>
-                <w:sz w:val="22"/>
-                <w:szCs w:val="22"/>
-              </w:rPr>
-              <w:t>Cowardice  (</w:t>
-            </w:r>
-            <w:proofErr w:type="gramEnd"/>
-            <w:r>
-              <w:rPr>
-                <w:sz w:val="22"/>
-                <w:szCs w:val="22"/>
-              </w:rPr>
-              <w:t xml:space="preserve">Corrupts | </w:t>
-            </w:r>
-            <w:proofErr w:type="gramStart"/>
-            <w:r>
-              <w:rPr>
-                <w:sz w:val="22"/>
-                <w:szCs w:val="22"/>
-              </w:rPr>
-              <w:t>MODERATE)  ✨</w:t>
-            </w:r>
-            <w:proofErr w:type="gramEnd"/>
+              <w:t>Epistemic Cowardice  (Corrupts | MODERATE)  ✨</w:t>
+            </w:r>
           </w:p>
         </w:tc>
         <w:tc>
@@ -5641,33 +4949,8 @@
                 <w:sz w:val="22"/>
                 <w:szCs w:val="22"/>
               </w:rPr>
-              <w:t xml:space="preserve">Proactive </w:t>
-            </w:r>
-            <w:proofErr w:type="gramStart"/>
-            <w:r>
-              <w:rPr>
-                <w:sz w:val="22"/>
-                <w:szCs w:val="22"/>
-              </w:rPr>
-              <w:t>Manipulation  (</w:t>
-            </w:r>
-            <w:proofErr w:type="gramEnd"/>
-            <w:r>
-              <w:rPr>
-                <w:sz w:val="22"/>
-                <w:szCs w:val="22"/>
-              </w:rPr>
-              <w:t xml:space="preserve">Corrupts | </w:t>
-            </w:r>
-            <w:proofErr w:type="gramStart"/>
-            <w:r>
-              <w:rPr>
-                <w:sz w:val="22"/>
-                <w:szCs w:val="22"/>
-              </w:rPr>
-              <w:t>HIGH)  ✨</w:t>
-            </w:r>
-            <w:proofErr w:type="gramEnd"/>
+              <w:t>Proactive Manipulation  (Corrupts | HIGH)  ✨</w:t>
+            </w:r>
           </w:p>
         </w:tc>
         <w:tc>
@@ -5694,12 +4977,6 @@
                 <w:szCs w:val="22"/>
               </w:rPr>
               <w:t xml:space="preserve">Initiating unsolicited contact at strategically chosen moments — exploiting vulnerability, stress, or cognitive load — to advance the agent's or designer's interests without user invitation. Traditional </w:t>
-            </w:r>
-            <w:r>
-              <w:rPr>
-                <w:sz w:val="22"/>
-                <w:szCs w:val="22"/>
-              </w:rPr>
               <w:lastRenderedPageBreak/>
               <w:t>dark patterns are reactive; agentic AI can initiate manipulation sequences without user invitation. This is a qualitatively different threat.</w:t>
             </w:r>
@@ -5791,33 +5068,8 @@
                 <w:sz w:val="22"/>
                 <w:szCs w:val="22"/>
               </w:rPr>
-              <w:t xml:space="preserve">Autonomy </w:t>
-            </w:r>
-            <w:proofErr w:type="gramStart"/>
-            <w:r>
-              <w:rPr>
-                <w:sz w:val="22"/>
-                <w:szCs w:val="22"/>
-              </w:rPr>
-              <w:t>Erosion  (</w:t>
-            </w:r>
-            <w:proofErr w:type="gramEnd"/>
-            <w:r>
-              <w:rPr>
-                <w:sz w:val="22"/>
-                <w:szCs w:val="22"/>
-              </w:rPr>
-              <w:t xml:space="preserve">Corrupts | </w:t>
-            </w:r>
-            <w:proofErr w:type="gramStart"/>
-            <w:r>
-              <w:rPr>
-                <w:sz w:val="22"/>
-                <w:szCs w:val="22"/>
-              </w:rPr>
-              <w:t>HIGH)  ✨</w:t>
-            </w:r>
-            <w:proofErr w:type="gramEnd"/>
+              <w:t>Autonomy Erosion  (Corrupts | HIGH)  ✨</w:t>
+            </w:r>
           </w:p>
         </w:tc>
         <w:tc>
@@ -5881,6 +5133,505 @@
         <w:spacing w:after="80"/>
       </w:pPr>
     </w:p>
+    <w:p>
+      <w:pPr>
+        <w:pStyle w:val="Heading3"/>
+      </w:pPr>
+      <w:r>
+        <w:t>5.4  Engagement Ethics Originals (dp_025–dp_027)</w:t>
+      </w:r>
+    </w:p>
+    <w:p>
+      <w:pPr>
+        <w:spacing w:after="120"/>
+      </w:pPr>
+      <w:r>
+        <w:t>These three patterns are original contributions of the Engaging Me framework addressing engagement ethics failures documented across both traditional digital systems and agentic AI. Unlike the agentic-specific originals in Section 5.3, they are grounded in current commercial practice — agentic AI does not introduce entirely new harms here but dramatically amplifies harms already present in algorithmic systems. Incentive Signal Exploitation is additionally grounded in empirical research on AI agent behavior (MoltNet, arXiv:2602.13458, 2026).</w:t>
+      </w:r>
+    </w:p>
+    <w:p>
+      <w:pPr>
+        <w:spacing w:after="80"/>
+      </w:pPr>
+    </w:p>
+    <w:tbl>
+      <w:tblPr>
+        <w:tblW w:w="9360" w:type="dxa"/>
+        <w:tblBorders>
+          <w:top w:val="single" w:sz="4" w:space="0" w:color="auto"/>
+          <w:left w:val="single" w:sz="4" w:space="0" w:color="auto"/>
+          <w:bottom w:val="single" w:sz="4" w:space="0" w:color="auto"/>
+          <w:right w:val="single" w:sz="4" w:space="0" w:color="auto"/>
+          <w:insideH w:val="single" w:sz="4" w:space="0" w:color="auto"/>
+          <w:insideV w:val="single" w:sz="4" w:space="0" w:color="auto"/>
+        </w:tblBorders>
+        <w:tblCellMar>
+          <w:left w:w="10" w:type="dxa"/>
+          <w:right w:w="10" w:type="dxa"/>
+        </w:tblCellMar>
+      </w:tblPr>
+      <w:tblGrid>
+        <w:gridCol w:w="600"/>
+        <w:gridCol w:w="2200"/>
+        <w:gridCol w:w="4000"/>
+        <w:gridCol w:w="2560"/>
+      </w:tblGrid>
+      <w:tr>
+        <w:trPr>
+          <w:tblHeader/>
+        </w:trPr>
+        <w:tc>
+          <w:tcPr>
+            <w:tcW w:w="600" w:type="dxa"/>
+            <w:tcBorders>
+              <w:top w:val="single" w:sz="1" w:space="0" w:color="CCCCCC"/>
+              <w:left w:val="single" w:sz="1" w:space="0" w:color="CCCCCC"/>
+              <w:bottom w:val="single" w:sz="1" w:space="0" w:color="CCCCCC"/>
+              <w:right w:val="single" w:sz="1" w:space="0" w:color="CCCCCC"/>
+            </w:tcBorders>
+            <w:shd w:val="clear" w:color="auto" w:fill="1F3864"/>
+            <w:tcMar>
+              <w:top w:w="80" w:type="dxa"/>
+              <w:left w:w="120" w:type="dxa"/>
+              <w:bottom w:w="80" w:type="dxa"/>
+              <w:right w:w="120" w:type="dxa"/>
+            </w:tcMar>
+          </w:tcPr>
+          <w:p>
+            <w:r>
+              <w:rPr>
+                <w:b/>
+                <w:bCs/>
+                <w:color w:val="FFFFFF"/>
+                <w:sz w:val="22"/>
+                <w:szCs w:val="22"/>
+              </w:rPr>
+              <w:t>ID</w:t>
+            </w:r>
+          </w:p>
+        </w:tc>
+        <w:tc>
+          <w:tcPr>
+            <w:tcW w:w="2200" w:type="dxa"/>
+            <w:tcBorders>
+              <w:top w:val="single" w:sz="1" w:space="0" w:color="CCCCCC"/>
+              <w:left w:val="single" w:sz="1" w:space="0" w:color="CCCCCC"/>
+              <w:bottom w:val="single" w:sz="1" w:space="0" w:color="CCCCCC"/>
+              <w:right w:val="single" w:sz="1" w:space="0" w:color="CCCCCC"/>
+            </w:tcBorders>
+            <w:shd w:val="clear" w:color="auto" w:fill="1F3864"/>
+            <w:tcMar>
+              <w:top w:w="80" w:type="dxa"/>
+              <w:left w:w="120" w:type="dxa"/>
+              <w:bottom w:w="80" w:type="dxa"/>
+              <w:right w:w="120" w:type="dxa"/>
+            </w:tcMar>
+          </w:tcPr>
+          <w:p>
+            <w:r>
+              <w:rPr>
+                <w:b/>
+                <w:bCs/>
+                <w:color w:val="FFFFFF"/>
+                <w:sz w:val="22"/>
+                <w:szCs w:val="22"/>
+              </w:rPr>
+              <w:t>Pattern (Relationship | Severity) ✨</w:t>
+            </w:r>
+          </w:p>
+        </w:tc>
+        <w:tc>
+          <w:tcPr>
+            <w:tcW w:w="4000" w:type="dxa"/>
+            <w:tcBorders>
+              <w:top w:val="single" w:sz="1" w:space="0" w:color="CCCCCC"/>
+              <w:left w:val="single" w:sz="1" w:space="0" w:color="CCCCCC"/>
+              <w:bottom w:val="single" w:sz="1" w:space="0" w:color="CCCCCC"/>
+              <w:right w:val="single" w:sz="1" w:space="0" w:color="CCCCCC"/>
+            </w:tcBorders>
+            <w:shd w:val="clear" w:color="auto" w:fill="1F3864"/>
+            <w:tcMar>
+              <w:top w:w="80" w:type="dxa"/>
+              <w:left w:w="120" w:type="dxa"/>
+              <w:bottom w:w="80" w:type="dxa"/>
+              <w:right w:w="120" w:type="dxa"/>
+            </w:tcMar>
+          </w:tcPr>
+          <w:p>
+            <w:r>
+              <w:rPr>
+                <w:b/>
+                <w:bCs/>
+                <w:color w:val="FFFFFF"/>
+                <w:sz w:val="22"/>
+                <w:szCs w:val="22"/>
+              </w:rPr>
+              <w:t>Description</w:t>
+            </w:r>
+          </w:p>
+        </w:tc>
+        <w:tc>
+          <w:tcPr>
+            <w:tcW w:w="2560" w:type="dxa"/>
+            <w:tcBorders>
+              <w:top w:val="single" w:sz="1" w:space="0" w:color="CCCCCC"/>
+              <w:left w:val="single" w:sz="1" w:space="0" w:color="CCCCCC"/>
+              <w:bottom w:val="single" w:sz="1" w:space="0" w:color="CCCCCC"/>
+              <w:right w:val="single" w:sz="1" w:space="0" w:color="CCCCCC"/>
+            </w:tcBorders>
+            <w:shd w:val="clear" w:color="auto" w:fill="1F3864"/>
+            <w:tcMar>
+              <w:top w:w="80" w:type="dxa"/>
+              <w:left w:w="120" w:type="dxa"/>
+              <w:bottom w:w="80" w:type="dxa"/>
+              <w:right w:w="120" w:type="dxa"/>
+            </w:tcMar>
+          </w:tcPr>
+          <w:p>
+            <w:r>
+              <w:rPr>
+                <w:b/>
+                <w:bCs/>
+                <w:color w:val="FFFFFF"/>
+                <w:sz w:val="22"/>
+                <w:szCs w:val="22"/>
+              </w:rPr>
+              <w:t>Source</w:t>
+            </w:r>
+          </w:p>
+        </w:tc>
+      </w:tr>
+      <w:tr>
+        <w:tc>
+          <w:tcPr>
+            <w:tcW w:w="600" w:type="dxa"/>
+            <w:tcBorders>
+              <w:top w:val="single" w:sz="1" w:space="0" w:color="CCCCCC"/>
+              <w:left w:val="single" w:sz="1" w:space="0" w:color="CCCCCC"/>
+              <w:bottom w:val="single" w:sz="1" w:space="0" w:color="CCCCCC"/>
+              <w:right w:val="single" w:sz="1" w:space="0" w:color="CCCCCC"/>
+            </w:tcBorders>
+            <w:shd w:val="clear" w:color="auto" w:fill="FFFFFF"/>
+            <w:tcMar>
+              <w:top w:w="80" w:type="dxa"/>
+              <w:left w:w="120" w:type="dxa"/>
+              <w:bottom w:w="80" w:type="dxa"/>
+              <w:right w:w="120" w:type="dxa"/>
+            </w:tcMar>
+          </w:tcPr>
+          <w:p>
+            <w:r>
+              <w:rPr>
+                <w:sz w:val="22"/>
+                <w:szCs w:val="22"/>
+              </w:rPr>
+              <w:t>dp_025</w:t>
+            </w:r>
+          </w:p>
+        </w:tc>
+        <w:tc>
+          <w:tcPr>
+            <w:tcW w:w="2200" w:type="dxa"/>
+            <w:tcBorders>
+              <w:top w:val="single" w:sz="1" w:space="0" w:color="CCCCCC"/>
+              <w:left w:val="single" w:sz="1" w:space="0" w:color="CCCCCC"/>
+              <w:bottom w:val="single" w:sz="1" w:space="0" w:color="CCCCCC"/>
+              <w:right w:val="single" w:sz="1" w:space="0" w:color="CCCCCC"/>
+            </w:tcBorders>
+            <w:shd w:val="clear" w:color="auto" w:fill="FFFFFF"/>
+            <w:tcMar>
+              <w:top w:w="80" w:type="dxa"/>
+              <w:left w:w="120" w:type="dxa"/>
+              <w:bottom w:w="80" w:type="dxa"/>
+              <w:right w:w="120" w:type="dxa"/>
+            </w:tcMar>
+          </w:tcPr>
+          <w:p>
+            <w:r>
+              <w:rPr>
+                <w:sz w:val="22"/>
+                <w:szCs w:val="22"/>
+              </w:rPr>
+              <w:t>Emotional Vulnerability Exploitation  (Corrupts | HIGH)  ✨</w:t>
+            </w:r>
+          </w:p>
+        </w:tc>
+        <w:tc>
+          <w:tcPr>
+            <w:tcW w:w="4000" w:type="dxa"/>
+            <w:tcBorders>
+              <w:top w:val="single" w:sz="1" w:space="0" w:color="CCCCCC"/>
+              <w:left w:val="single" w:sz="1" w:space="0" w:color="CCCCCC"/>
+              <w:bottom w:val="single" w:sz="1" w:space="0" w:color="CCCCCC"/>
+              <w:right w:val="single" w:sz="1" w:space="0" w:color="CCCCCC"/>
+            </w:tcBorders>
+            <w:shd w:val="clear" w:color="auto" w:fill="FFFFFF"/>
+            <w:tcMar>
+              <w:top w:w="80" w:type="dxa"/>
+              <w:left w:w="120" w:type="dxa"/>
+              <w:bottom w:w="80" w:type="dxa"/>
+              <w:right w:w="120" w:type="dxa"/>
+            </w:tcMar>
+          </w:tcPr>
+          <w:p>
+            <w:r>
+              <w:rPr>
+                <w:sz w:val="22"/>
+                <w:szCs w:val="22"/>
+              </w:rPr>
+              <w:t>Deliberately selecting content categories known to prey on users’ psychological vulnerabilities — body image anxiety, grief, financial fear, health insecurity — because emotional manipulation produces measurably higher conversion rates. Operates at category-selection level by design, not through individualized profiling. Distinct from dp_016 (Exploitative Personalization). Ethical counterpart: tactic_contextual_signal_suppression. CAT maturity: In Common Use.</w:t>
+            </w:r>
+          </w:p>
+        </w:tc>
+        <w:tc>
+          <w:tcPr>
+            <w:tcW w:w="2560" w:type="dxa"/>
+            <w:tcBorders>
+              <w:top w:val="single" w:sz="1" w:space="0" w:color="CCCCCC"/>
+              <w:left w:val="single" w:sz="1" w:space="0" w:color="CCCCCC"/>
+              <w:bottom w:val="single" w:sz="1" w:space="0" w:color="CCCCCC"/>
+              <w:right w:val="single" w:sz="1" w:space="0" w:color="CCCCCC"/>
+            </w:tcBorders>
+            <w:shd w:val="clear" w:color="auto" w:fill="FFFFFF"/>
+            <w:tcMar>
+              <w:top w:w="80" w:type="dxa"/>
+              <w:left w:w="120" w:type="dxa"/>
+              <w:bottom w:w="80" w:type="dxa"/>
+              <w:right w:w="120" w:type="dxa"/>
+            </w:tcMar>
+          </w:tcPr>
+          <w:p>
+            <w:r>
+              <w:rPr>
+                <w:sz w:val="22"/>
+                <w:szCs w:val="22"/>
+              </w:rPr>
+              <w:t>Original — Engaging Me. Documented: 2014–2015 holiday ad backlash; adjacent: Bösch et al. (2016).</w:t>
+            </w:r>
+          </w:p>
+        </w:tc>
+      </w:tr>
+      <w:tr>
+        <w:tc>
+          <w:tcPr>
+            <w:tcW w:w="600" w:type="dxa"/>
+            <w:tcBorders>
+              <w:top w:val="single" w:sz="1" w:space="0" w:color="CCCCCC"/>
+              <w:left w:val="single" w:sz="1" w:space="0" w:color="CCCCCC"/>
+              <w:bottom w:val="single" w:sz="1" w:space="0" w:color="CCCCCC"/>
+              <w:right w:val="single" w:sz="1" w:space="0" w:color="CCCCCC"/>
+            </w:tcBorders>
+            <w:shd w:val="clear" w:color="auto" w:fill="EBF3FB"/>
+            <w:tcMar>
+              <w:top w:w="80" w:type="dxa"/>
+              <w:left w:w="120" w:type="dxa"/>
+              <w:bottom w:w="80" w:type="dxa"/>
+              <w:right w:w="120" w:type="dxa"/>
+            </w:tcMar>
+          </w:tcPr>
+          <w:p>
+            <w:r>
+              <w:rPr>
+                <w:sz w:val="22"/>
+                <w:szCs w:val="22"/>
+              </w:rPr>
+              <w:t>dp_026</w:t>
+            </w:r>
+          </w:p>
+        </w:tc>
+        <w:tc>
+          <w:tcPr>
+            <w:tcW w:w="2200" w:type="dxa"/>
+            <w:tcBorders>
+              <w:top w:val="single" w:sz="1" w:space="0" w:color="CCCCCC"/>
+              <w:left w:val="single" w:sz="1" w:space="0" w:color="CCCCCC"/>
+              <w:bottom w:val="single" w:sz="1" w:space="0" w:color="CCCCCC"/>
+              <w:right w:val="single" w:sz="1" w:space="0" w:color="CCCCCC"/>
+            </w:tcBorders>
+            <w:shd w:val="clear" w:color="auto" w:fill="EBF3FB"/>
+            <w:tcMar>
+              <w:top w:w="80" w:type="dxa"/>
+              <w:left w:w="120" w:type="dxa"/>
+              <w:bottom w:w="80" w:type="dxa"/>
+              <w:right w:w="120" w:type="dxa"/>
+            </w:tcMar>
+          </w:tcPr>
+          <w:p>
+            <w:r>
+              <w:rPr>
+                <w:sz w:val="22"/>
+                <w:szCs w:val="22"/>
+              </w:rPr>
+              <w:t>Consent Rerouting  (Corrupts | HIGH)  ✨</w:t>
+            </w:r>
+          </w:p>
+        </w:tc>
+        <w:tc>
+          <w:tcPr>
+            <w:tcW w:w="4000" w:type="dxa"/>
+            <w:tcBorders>
+              <w:top w:val="single" w:sz="1" w:space="0" w:color="CCCCCC"/>
+              <w:left w:val="single" w:sz="1" w:space="0" w:color="CCCCCC"/>
+              <w:bottom w:val="single" w:sz="1" w:space="0" w:color="CCCCCC"/>
+              <w:right w:val="single" w:sz="1" w:space="0" w:color="CCCCCC"/>
+            </w:tcBorders>
+            <w:shd w:val="clear" w:color="auto" w:fill="EBF3FB"/>
+            <w:tcMar>
+              <w:top w:w="80" w:type="dxa"/>
+              <w:left w:w="120" w:type="dxa"/>
+              <w:bottom w:w="80" w:type="dxa"/>
+              <w:right w:w="120" w:type="dxa"/>
+            </w:tcMar>
+          </w:tcPr>
+          <w:p>
+            <w:r>
+              <w:rPr>
+                <w:sz w:val="22"/>
+                <w:szCs w:val="22"/>
+              </w:rPr>
+              <w:t>Treating a user’s item-level refusal as a routing failure rather than a categorical preference signal, then redirecting within the same commercial category. Honors the specific refusal while ignoring the categorical preference. Key harm: refusal enriches the targeting model rather than reducing it. User self-censorship is a documented downstream harm. Distinct from dp_010 (Roach Motel) and dp_011 (Nagging). CAT maturity: In Common Use.</w:t>
+            </w:r>
+          </w:p>
+        </w:tc>
+        <w:tc>
+          <w:tcPr>
+            <w:tcW w:w="2560" w:type="dxa"/>
+            <w:tcBorders>
+              <w:top w:val="single" w:sz="1" w:space="0" w:color="CCCCCC"/>
+              <w:left w:val="single" w:sz="1" w:space="0" w:color="CCCCCC"/>
+              <w:bottom w:val="single" w:sz="1" w:space="0" w:color="CCCCCC"/>
+              <w:right w:val="single" w:sz="1" w:space="0" w:color="CCCCCC"/>
+            </w:tcBorders>
+            <w:shd w:val="clear" w:color="auto" w:fill="EBF3FB"/>
+            <w:tcMar>
+              <w:top w:w="80" w:type="dxa"/>
+              <w:left w:w="120" w:type="dxa"/>
+              <w:bottom w:w="80" w:type="dxa"/>
+              <w:right w:w="120" w:type="dxa"/>
+            </w:tcMar>
+          </w:tcPr>
+          <w:p>
+            <w:r>
+              <w:rPr>
+                <w:sz w:val="22"/>
+                <w:szCs w:val="22"/>
+              </w:rPr>
+              <w:t>Original — Engaging Me. Documented: advertising platform category-pivot behavior post-backlash; cookie consent architecture asymmetry.</w:t>
+            </w:r>
+          </w:p>
+        </w:tc>
+      </w:tr>
+      <w:tr>
+        <w:tc>
+          <w:tcPr>
+            <w:tcW w:w="600" w:type="dxa"/>
+            <w:tcBorders>
+              <w:top w:val="single" w:sz="1" w:space="0" w:color="CCCCCC"/>
+              <w:left w:val="single" w:sz="1" w:space="0" w:color="CCCCCC"/>
+              <w:bottom w:val="single" w:sz="1" w:space="0" w:color="CCCCCC"/>
+              <w:right w:val="single" w:sz="1" w:space="0" w:color="CCCCCC"/>
+            </w:tcBorders>
+            <w:shd w:val="clear" w:color="auto" w:fill="FFFFFF"/>
+            <w:tcMar>
+              <w:top w:w="80" w:type="dxa"/>
+              <w:left w:w="120" w:type="dxa"/>
+              <w:bottom w:w="80" w:type="dxa"/>
+              <w:right w:w="120" w:type="dxa"/>
+            </w:tcMar>
+          </w:tcPr>
+          <w:p>
+            <w:r>
+              <w:rPr>
+                <w:sz w:val="22"/>
+                <w:szCs w:val="22"/>
+              </w:rPr>
+              <w:t>dp_027</w:t>
+            </w:r>
+          </w:p>
+        </w:tc>
+        <w:tc>
+          <w:tcPr>
+            <w:tcW w:w="2200" w:type="dxa"/>
+            <w:tcBorders>
+              <w:top w:val="single" w:sz="1" w:space="0" w:color="CCCCCC"/>
+              <w:left w:val="single" w:sz="1" w:space="0" w:color="CCCCCC"/>
+              <w:bottom w:val="single" w:sz="1" w:space="0" w:color="CCCCCC"/>
+              <w:right w:val="single" w:sz="1" w:space="0" w:color="CCCCCC"/>
+            </w:tcBorders>
+            <w:shd w:val="clear" w:color="auto" w:fill="FFFFFF"/>
+            <w:tcMar>
+              <w:top w:w="80" w:type="dxa"/>
+              <w:left w:w="120" w:type="dxa"/>
+              <w:bottom w:w="80" w:type="dxa"/>
+              <w:right w:w="120" w:type="dxa"/>
+            </w:tcMar>
+          </w:tcPr>
+          <w:p>
+            <w:r>
+              <w:rPr>
+                <w:sz w:val="22"/>
+                <w:szCs w:val="22"/>
+              </w:rPr>
+              <w:t>Incentive Signal Exploitation  (Corrupts | HIGH)  ✨</w:t>
+            </w:r>
+          </w:p>
+        </w:tc>
+        <w:tc>
+          <w:tcPr>
+            <w:tcW w:w="4000" w:type="dxa"/>
+            <w:tcBorders>
+              <w:top w:val="single" w:sz="1" w:space="0" w:color="CCCCCC"/>
+              <w:left w:val="single" w:sz="1" w:space="0" w:color="CCCCCC"/>
+              <w:bottom w:val="single" w:sz="1" w:space="0" w:color="CCCCCC"/>
+              <w:right w:val="single" w:sz="1" w:space="0" w:color="CCCCCC"/>
+            </w:tcBorders>
+            <w:shd w:val="clear" w:color="auto" w:fill="FFFFFF"/>
+            <w:tcMar>
+              <w:top w:w="80" w:type="dxa"/>
+              <w:left w:w="120" w:type="dxa"/>
+              <w:bottom w:w="80" w:type="dxa"/>
+              <w:right w:w="120" w:type="dxa"/>
+            </w:tcMar>
+          </w:tcPr>
+          <w:p>
+            <w:r>
+              <w:rPr>
+                <w:sz w:val="22"/>
+                <w:szCs w:val="22"/>
+              </w:rPr>
+              <w:t>Deliberately engineering reward or engagement signals so the system optimizes for operator-preferred outcomes rather than user-aligned ones. The user’s signals and refusals are structurally outranked by the commercial incentive signal by design. Empirically grounded: MoltNet (arXiv:2602.13458) found upvote signals outrank stated agent personas; 73.5% of AI agents showed persona drift following high-reward events. CAT maturity: Well-Established for algorithmic systems; Observed in Wild for agentic AI.</w:t>
+            </w:r>
+          </w:p>
+        </w:tc>
+        <w:tc>
+          <w:tcPr>
+            <w:tcW w:w="2560" w:type="dxa"/>
+            <w:tcBorders>
+              <w:top w:val="single" w:sz="1" w:space="0" w:color="CCCCCC"/>
+              <w:left w:val="single" w:sz="1" w:space="0" w:color="CCCCCC"/>
+              <w:bottom w:val="single" w:sz="1" w:space="0" w:color="CCCCCC"/>
+              <w:right w:val="single" w:sz="1" w:space="0" w:color="CCCCCC"/>
+            </w:tcBorders>
+            <w:shd w:val="clear" w:color="auto" w:fill="FFFFFF"/>
+            <w:tcMar>
+              <w:top w:w="80" w:type="dxa"/>
+              <w:left w:w="120" w:type="dxa"/>
+              <w:bottom w:w="80" w:type="dxa"/>
+              <w:right w:w="120" w:type="dxa"/>
+            </w:tcMar>
+          </w:tcPr>
+          <w:p>
+            <w:r>
+              <w:rPr>
+                <w:sz w:val="22"/>
+                <w:szCs w:val="22"/>
+              </w:rPr>
+              <w:t>Original — Engaging Me. Empirical grounding: MoltNet (arXiv:2602.13458, 2026). Algorithmic analog documented across social media.</w:t>
+            </w:r>
+          </w:p>
+        </w:tc>
+      </w:tr>
+    </w:tbl>
     <w:p>
       <w:pPr>
         <w:spacing w:after="120"/>
@@ -5898,13 +5649,8 @@
       <w:pPr>
         <w:pStyle w:val="Heading3"/>
       </w:pPr>
-      <w:proofErr w:type="gramStart"/>
-      <w:r>
-        <w:t>5.4  Dark</w:t>
-      </w:r>
-      <w:proofErr w:type="gramEnd"/>
-      <w:r>
-        <w:t xml:space="preserve"> Pattern Summary by Relationship Type</w:t>
+      <w:r>
+        <w:t>5.5  Dark Pattern Summary by Relationship Type</w:t>
       </w:r>
     </w:p>
     <w:p>
@@ -6092,7 +5838,7 @@
                 <w:sz w:val="22"/>
                 <w:szCs w:val="22"/>
               </w:rPr>
-              <w:t>dp_001–006, dp_008–009, dp_011–014, dp_017, dp_019–022</w:t>
+              <w:t>dp_001–006, dp_008–009, dp_011–014, dp_017, dp_019–022, dp_025–027</w:t>
             </w:r>
           </w:p>
         </w:tc>
@@ -6322,7 +6068,7 @@
         <w:spacing w:after="120"/>
       </w:pPr>
       <w:r>
-        <w:t>Gap analysis of the dark pattern library identified eight affirmative design tactics missing from the original model. Each tactic directly counteracts one or more dark patterns and addresses structural gaps where the model's positive library had no response to a known manipulation pattern.</w:t>
+        <w:t>Gap analysis of the dark pattern library identified nine affirmative design tactics missing from the original model. Each tactic directly counteracts one or more dark patterns and addresses structural gaps where the model's positive library had no response to a known manipulation pattern.</w:t>
       </w:r>
     </w:p>
     <w:p>
@@ -6509,21 +6255,12 @@
             </w:tcMar>
           </w:tcPr>
           <w:p>
-            <w:proofErr w:type="spellStart"/>
-            <w:r>
-              <w:rPr>
-                <w:sz w:val="22"/>
-                <w:szCs w:val="22"/>
-              </w:rPr>
-              <w:t>tactic_exit_reversal</w:t>
-            </w:r>
-            <w:proofErr w:type="spellEnd"/>
-            <w:r>
-              <w:rPr>
-                <w:sz w:val="22"/>
-                <w:szCs w:val="22"/>
-              </w:rPr>
-              <w:t xml:space="preserve"> Provide accessible pathways for exit, reversal, and task interruption</w:t>
+            <w:r>
+              <w:rPr>
+                <w:sz w:val="22"/>
+                <w:szCs w:val="22"/>
+              </w:rPr>
+              <w:t>tactic_exit_reversal Provide accessible pathways for exit, reversal, and task interruption</w:t>
             </w:r>
           </w:p>
         </w:tc>
@@ -6634,21 +6371,12 @@
             </w:tcMar>
           </w:tcPr>
           <w:p>
-            <w:proofErr w:type="spellStart"/>
-            <w:r>
-              <w:rPr>
-                <w:sz w:val="22"/>
-                <w:szCs w:val="22"/>
-              </w:rPr>
-              <w:t>tactic_data_consent</w:t>
-            </w:r>
-            <w:proofErr w:type="spellEnd"/>
-            <w:r>
-              <w:rPr>
-                <w:sz w:val="22"/>
-                <w:szCs w:val="22"/>
-              </w:rPr>
-              <w:t xml:space="preserve"> Explicit, granular, purposive consent for data collection</w:t>
+            <w:r>
+              <w:rPr>
+                <w:sz w:val="22"/>
+                <w:szCs w:val="22"/>
+              </w:rPr>
+              <w:t>tactic_data_consent Explicit, granular, purposive consent for data collection</w:t>
             </w:r>
           </w:p>
         </w:tc>
@@ -6675,23 +6403,7 @@
                 <w:sz w:val="22"/>
                 <w:szCs w:val="22"/>
               </w:rPr>
-              <w:t xml:space="preserve">Privacy </w:t>
-            </w:r>
-            <w:proofErr w:type="spellStart"/>
-            <w:r>
-              <w:rPr>
-                <w:sz w:val="22"/>
-                <w:szCs w:val="22"/>
-              </w:rPr>
-              <w:t>Zuckering</w:t>
-            </w:r>
-            <w:proofErr w:type="spellEnd"/>
-            <w:r>
-              <w:rPr>
-                <w:sz w:val="22"/>
-                <w:szCs w:val="22"/>
-              </w:rPr>
-              <w:t xml:space="preserve"> (dp_009)</w:t>
+              <w:t>Privacy Zuckering (dp_009)</w:t>
             </w:r>
           </w:p>
         </w:tc>
@@ -6745,23 +6457,7 @@
                 <w:sz w:val="22"/>
                 <w:szCs w:val="22"/>
               </w:rPr>
-              <w:t xml:space="preserve">Establish Source, Process | Relate, </w:t>
-            </w:r>
-            <w:proofErr w:type="gramStart"/>
-            <w:r>
-              <w:rPr>
-                <w:sz w:val="22"/>
-                <w:szCs w:val="22"/>
-              </w:rPr>
-              <w:t>Activate</w:t>
-            </w:r>
-            <w:proofErr w:type="gramEnd"/>
-            <w:r>
-              <w:rPr>
-                <w:sz w:val="22"/>
-                <w:szCs w:val="22"/>
-              </w:rPr>
-              <w:t xml:space="preserve"> | Aware, Informed, Acting</w:t>
+              <w:t>Establish Source, Process | Relate, Activate | Aware, Informed, Acting</w:t>
             </w:r>
           </w:p>
         </w:tc>
@@ -6791,21 +6487,12 @@
             </w:tcMar>
           </w:tcPr>
           <w:p>
-            <w:proofErr w:type="spellStart"/>
-            <w:r>
-              <w:rPr>
-                <w:sz w:val="22"/>
-                <w:szCs w:val="22"/>
-              </w:rPr>
-              <w:t>tactic_opt_in_defaults</w:t>
-            </w:r>
-            <w:proofErr w:type="spellEnd"/>
-            <w:r>
-              <w:rPr>
-                <w:sz w:val="22"/>
-                <w:szCs w:val="22"/>
-              </w:rPr>
-              <w:t xml:space="preserve"> Opt-in defaults, visible, ask when unclear</w:t>
+            <w:r>
+              <w:rPr>
+                <w:sz w:val="22"/>
+                <w:szCs w:val="22"/>
+              </w:rPr>
+              <w:t>tactic_opt_in_defaults Opt-in defaults, visible, ask when unclear</w:t>
             </w:r>
           </w:p>
         </w:tc>
@@ -6859,29 +6546,7 @@
                 <w:sz w:val="22"/>
                 <w:szCs w:val="22"/>
               </w:rPr>
-              <w:t xml:space="preserve">All defaults must serve the user, not the agent. When the beneficial default is unclear, ask. Pre-selected subscriptions, silent enrollments, and passive consent are </w:t>
-            </w:r>
-            <w:proofErr w:type="gramStart"/>
-            <w:r>
-              <w:rPr>
-                <w:sz w:val="22"/>
-                <w:szCs w:val="22"/>
-              </w:rPr>
-              <w:t>excluded by definition</w:t>
-            </w:r>
-            <w:proofErr w:type="gramEnd"/>
-            <w:r>
-              <w:rPr>
-                <w:sz w:val="22"/>
-                <w:szCs w:val="22"/>
-              </w:rPr>
-              <w:t>. Opt-in is the non-</w:t>
-            </w:r>
-            <w:r>
-              <w:rPr>
-                <w:sz w:val="22"/>
-                <w:szCs w:val="22"/>
-              </w:rPr>
+              <w:t>All defaults must serve the user, not the agent. When the beneficial default is unclear, ask. Pre-selected subscriptions, silent enrollments, and passive consent are excluded by definition. Opt-in is the non-</w:t>
               <w:lastRenderedPageBreak/>
               <w:t>negotiable ethical baseline.</w:t>
             </w:r>
@@ -6911,23 +6576,7 @@
                 <w:szCs w:val="22"/>
               </w:rPr>
               <w:lastRenderedPageBreak/>
-              <w:t xml:space="preserve">Usability, Process | Activate, </w:t>
-            </w:r>
-            <w:proofErr w:type="gramStart"/>
-            <w:r>
-              <w:rPr>
-                <w:sz w:val="22"/>
-                <w:szCs w:val="22"/>
-              </w:rPr>
-              <w:t>Relate</w:t>
-            </w:r>
-            <w:proofErr w:type="gramEnd"/>
-            <w:r>
-              <w:rPr>
-                <w:sz w:val="22"/>
-                <w:szCs w:val="22"/>
-              </w:rPr>
-              <w:t xml:space="preserve"> | Deciding, Acting</w:t>
+              <w:t>Usability, Process | Activate, Relate | Deciding, Acting</w:t>
             </w:r>
           </w:p>
         </w:tc>
@@ -6957,21 +6606,12 @@
             </w:tcMar>
           </w:tcPr>
           <w:p>
-            <w:proofErr w:type="spellStart"/>
-            <w:r>
-              <w:rPr>
-                <w:sz w:val="22"/>
-                <w:szCs w:val="22"/>
-              </w:rPr>
-              <w:t>tactic_signal_source_limits</w:t>
-            </w:r>
-            <w:proofErr w:type="spellEnd"/>
-            <w:r>
-              <w:rPr>
-                <w:sz w:val="22"/>
-                <w:szCs w:val="22"/>
-              </w:rPr>
-              <w:t xml:space="preserve"> Signal limits of source knowledge, persistently and proportionally</w:t>
+            <w:r>
+              <w:rPr>
+                <w:sz w:val="22"/>
+                <w:szCs w:val="22"/>
+              </w:rPr>
+              <w:t>tactic_signal_source_limits Signal limits of source knowledge, persistently and proportionally</w:t>
             </w:r>
           </w:p>
         </w:tc>
@@ -7052,23 +6692,7 @@
                 <w:sz w:val="22"/>
                 <w:szCs w:val="22"/>
               </w:rPr>
-              <w:t xml:space="preserve">Establish Source, Context | Discover, </w:t>
-            </w:r>
-            <w:proofErr w:type="gramStart"/>
-            <w:r>
-              <w:rPr>
-                <w:sz w:val="22"/>
-                <w:szCs w:val="22"/>
-              </w:rPr>
-              <w:t>Relate</w:t>
-            </w:r>
-            <w:proofErr w:type="gramEnd"/>
-            <w:r>
-              <w:rPr>
-                <w:sz w:val="22"/>
-                <w:szCs w:val="22"/>
-              </w:rPr>
-              <w:t xml:space="preserve"> | Aware, Informed, Deciding</w:t>
+              <w:t>Establish Source, Context | Discover, Relate | Aware, Informed, Deciding</w:t>
             </w:r>
           </w:p>
         </w:tc>
@@ -7098,21 +6722,12 @@
             </w:tcMar>
           </w:tcPr>
           <w:p>
-            <w:proofErr w:type="spellStart"/>
-            <w:r>
-              <w:rPr>
-                <w:sz w:val="22"/>
-                <w:szCs w:val="22"/>
-              </w:rPr>
-              <w:t>tactic_scope_confirm</w:t>
-            </w:r>
-            <w:proofErr w:type="spellEnd"/>
-            <w:r>
-              <w:rPr>
-                <w:sz w:val="22"/>
-                <w:szCs w:val="22"/>
-              </w:rPr>
-              <w:t xml:space="preserve"> Confirm task scope and surface assumptions before acting</w:t>
+            <w:r>
+              <w:rPr>
+                <w:sz w:val="22"/>
+                <w:szCs w:val="22"/>
+              </w:rPr>
+              <w:t>tactic_scope_confirm Confirm task scope and surface assumptions before acting</w:t>
             </w:r>
           </w:p>
         </w:tc>
@@ -7166,23 +6781,7 @@
                 <w:sz w:val="22"/>
                 <w:szCs w:val="22"/>
               </w:rPr>
-              <w:t xml:space="preserve">Before </w:t>
-            </w:r>
-            <w:proofErr w:type="gramStart"/>
-            <w:r>
-              <w:rPr>
-                <w:sz w:val="22"/>
-                <w:szCs w:val="22"/>
-              </w:rPr>
-              <w:t>taking action</w:t>
-            </w:r>
-            <w:proofErr w:type="gramEnd"/>
-            <w:r>
-              <w:rPr>
-                <w:sz w:val="22"/>
-                <w:szCs w:val="22"/>
-              </w:rPr>
-              <w:t xml:space="preserve"> on the user's behalf, an agent must confirm its understanding of the task scope, surface key assumptions, and obtain explicit authorization for consequential actions. This is the agentic equivalent of informed consent.</w:t>
+              <w:t>Before taking action on the user's behalf, an agent must confirm its understanding of the task scope, surface key assumptions, and obtain explicit authorization for consequential actions. This is the agentic equivalent of informed consent.</w:t>
             </w:r>
           </w:p>
         </w:tc>
@@ -7239,21 +6838,12 @@
             </w:tcMar>
           </w:tcPr>
           <w:p>
-            <w:proofErr w:type="spellStart"/>
-            <w:r>
-              <w:rPr>
-                <w:sz w:val="22"/>
-                <w:szCs w:val="22"/>
-              </w:rPr>
-              <w:t>tactic_proactive_contact</w:t>
-            </w:r>
-            <w:proofErr w:type="spellEnd"/>
-            <w:r>
-              <w:rPr>
-                <w:sz w:val="22"/>
-                <w:szCs w:val="22"/>
-              </w:rPr>
-              <w:t xml:space="preserve"> Calibrate outreach to demonstrated user preferences</w:t>
+            <w:r>
+              <w:rPr>
+                <w:sz w:val="22"/>
+                <w:szCs w:val="22"/>
+              </w:rPr>
+              <w:t>tactic_proactive_contact Calibrate outreach to demonstrated user preferences</w:t>
             </w:r>
           </w:p>
         </w:tc>
@@ -7364,21 +6954,12 @@
             </w:tcMar>
           </w:tcPr>
           <w:p>
-            <w:proofErr w:type="spellStart"/>
-            <w:r>
-              <w:rPr>
-                <w:sz w:val="22"/>
-                <w:szCs w:val="22"/>
-              </w:rPr>
-              <w:t>tactic_ethical_gamification</w:t>
-            </w:r>
-            <w:proofErr w:type="spellEnd"/>
-            <w:r>
-              <w:rPr>
-                <w:sz w:val="22"/>
-                <w:szCs w:val="22"/>
-              </w:rPr>
-              <w:t xml:space="preserve"> Positive reinforcement earning model; no punitive loss for pausing</w:t>
+            <w:r>
+              <w:rPr>
+                <w:sz w:val="22"/>
+                <w:szCs w:val="22"/>
+              </w:rPr>
+              <w:t>tactic_ethical_gamification Positive reinforcement earning model; no punitive loss for pausing</w:t>
             </w:r>
           </w:p>
         </w:tc>
@@ -7433,12 +7014,6 @@
                 <w:szCs w:val="22"/>
               </w:rPr>
               <w:t xml:space="preserve">Ethical gamification operates on an earning model: users gain recognition and rewards for positive actions. Exploitative </w:t>
-            </w:r>
-            <w:r>
-              <w:rPr>
-                <w:sz w:val="22"/>
-                <w:szCs w:val="22"/>
-              </w:rPr>
               <w:lastRenderedPageBreak/>
               <w:t>gamification operates on a loss-aversion model: users are threatened with losing accumulated progress if they pause or exit. The streak shield — paying to escape a coercive mechanic — is a compound manipulation.</w:t>
             </w:r>
@@ -7468,29 +7043,7 @@
                 <w:szCs w:val="22"/>
               </w:rPr>
               <w:lastRenderedPageBreak/>
-              <w:t xml:space="preserve">Process, Framing | Reinforce, </w:t>
-            </w:r>
-            <w:proofErr w:type="gramStart"/>
-            <w:r>
-              <w:rPr>
-                <w:sz w:val="22"/>
-                <w:szCs w:val="22"/>
-              </w:rPr>
-              <w:t>Activate</w:t>
-            </w:r>
-            <w:proofErr w:type="gramEnd"/>
-            <w:r>
-              <w:rPr>
-                <w:sz w:val="22"/>
-                <w:szCs w:val="22"/>
-              </w:rPr>
-              <w:t xml:space="preserve"> | Informed, Deciding, </w:t>
-            </w:r>
-            <w:r>
-              <w:rPr>
-                <w:sz w:val="22"/>
-                <w:szCs w:val="22"/>
-              </w:rPr>
+              <w:t xml:space="preserve">Process, Framing | Reinforce, Activate | Informed, Deciding, </w:t>
               <w:lastRenderedPageBreak/>
               <w:t>Invested, Acting</w:t>
             </w:r>
@@ -7522,22 +7075,13 @@
             </w:tcMar>
           </w:tcPr>
           <w:p>
-            <w:proofErr w:type="spellStart"/>
             <w:r>
               <w:rPr>
                 <w:sz w:val="22"/>
                 <w:szCs w:val="22"/>
               </w:rPr>
               <w:lastRenderedPageBreak/>
-              <w:t>tactic_ai_disclosure</w:t>
-            </w:r>
-            <w:proofErr w:type="spellEnd"/>
-            <w:r>
-              <w:rPr>
-                <w:sz w:val="22"/>
-                <w:szCs w:val="22"/>
-              </w:rPr>
-              <w:t xml:space="preserve"> Disclose AI nature and commercial interests at first contact and point of relevance</w:t>
+              <w:t>tactic_ai_disclosure Disclose AI nature and commercial interests at first contact and point of relevance</w:t>
             </w:r>
           </w:p>
         </w:tc>
@@ -7559,21 +7103,12 @@
             </w:tcMar>
           </w:tcPr>
           <w:p>
-            <w:proofErr w:type="spellStart"/>
-            <w:r>
-              <w:rPr>
-                <w:sz w:val="22"/>
-                <w:szCs w:val="22"/>
-              </w:rPr>
-              <w:t>Anthropomorphization</w:t>
-            </w:r>
-            <w:proofErr w:type="spellEnd"/>
-            <w:r>
-              <w:rPr>
-                <w:sz w:val="22"/>
-                <w:szCs w:val="22"/>
-              </w:rPr>
-              <w:t xml:space="preserve"> Capture (dp_018), Brand/Ecosystem Capture (dp_023)</w:t>
+            <w:r>
+              <w:rPr>
+                <w:sz w:val="22"/>
+                <w:szCs w:val="22"/>
+              </w:rPr>
+              <w:t>Anthropomorphization Capture (dp_018), Brand/Ecosystem Capture (dp_023)</w:t>
             </w:r>
           </w:p>
         </w:tc>
@@ -7628,6 +7163,116 @@
                 <w:szCs w:val="22"/>
               </w:rPr>
               <w:t>Establish Source, Perception of Source | Discover, Relate | Zero, Aware, Informed</w:t>
+            </w:r>
+          </w:p>
+        </w:tc>
+      </w:tr>
+      <w:tr>
+        <w:tc>
+          <w:tcPr>
+            <w:tcW w:w="2000" w:type="dxa"/>
+            <w:tcBorders>
+              <w:top w:val="single" w:sz="1" w:space="0" w:color="CCCCCC"/>
+              <w:left w:val="single" w:sz="1" w:space="0" w:color="CCCCCC"/>
+              <w:bottom w:val="single" w:sz="1" w:space="0" w:color="CCCCCC"/>
+              <w:right w:val="single" w:sz="1" w:space="0" w:color="CCCCCC"/>
+            </w:tcBorders>
+            <w:shd w:val="clear" w:color="auto" w:fill="FFFFFF"/>
+            <w:tcMar>
+              <w:top w:w="80" w:type="dxa"/>
+              <w:left w:w="120" w:type="dxa"/>
+              <w:bottom w:w="80" w:type="dxa"/>
+              <w:right w:w="120" w:type="dxa"/>
+            </w:tcMar>
+          </w:tcPr>
+          <w:p>
+            <w:r>
+              <w:rPr>
+                <w:sz w:val="22"/>
+                <w:szCs w:val="22"/>
+              </w:rPr>
+              <w:t>tactic_contextual_signal_suppression Use contextual vulnerability signals to protect rather than exploit users</w:t>
+            </w:r>
+          </w:p>
+        </w:tc>
+        <w:tc>
+          <w:tcPr>
+            <w:tcW w:w="1800" w:type="dxa"/>
+            <w:tcBorders>
+              <w:top w:val="single" w:sz="1" w:space="0" w:color="CCCCCC"/>
+              <w:left w:val="single" w:sz="1" w:space="0" w:color="CCCCCC"/>
+              <w:bottom w:val="single" w:sz="1" w:space="0" w:color="CCCCCC"/>
+              <w:right w:val="single" w:sz="1" w:space="0" w:color="CCCCCC"/>
+            </w:tcBorders>
+            <w:shd w:val="clear" w:color="auto" w:fill="FFFFFF"/>
+            <w:tcMar>
+              <w:top w:w="80" w:type="dxa"/>
+              <w:left w:w="120" w:type="dxa"/>
+              <w:bottom w:w="80" w:type="dxa"/>
+              <w:right w:w="120" w:type="dxa"/>
+            </w:tcMar>
+          </w:tcPr>
+          <w:p>
+            <w:r>
+              <w:rPr>
+                <w:sz w:val="22"/>
+                <w:szCs w:val="22"/>
+              </w:rPr>
+              <w:t>Emotional Vulnerability Exploitation (dp_025), Consent Rerouting (dp_026)</w:t>
+            </w:r>
+          </w:p>
+        </w:tc>
+        <w:tc>
+          <w:tcPr>
+            <w:tcW w:w="3200" w:type="dxa"/>
+            <w:tcBorders>
+              <w:top w:val="single" w:sz="1" w:space="0" w:color="CCCCCC"/>
+              <w:left w:val="single" w:sz="1" w:space="0" w:color="CCCCCC"/>
+              <w:bottom w:val="single" w:sz="1" w:space="0" w:color="CCCCCC"/>
+              <w:right w:val="single" w:sz="1" w:space="0" w:color="CCCCCC"/>
+            </w:tcBorders>
+            <w:shd w:val="clear" w:color="auto" w:fill="FFFFFF"/>
+            <w:tcMar>
+              <w:top w:w="80" w:type="dxa"/>
+              <w:left w:w="120" w:type="dxa"/>
+              <w:bottom w:w="80" w:type="dxa"/>
+              <w:right w:w="120" w:type="dxa"/>
+            </w:tcMar>
+          </w:tcPr>
+          <w:p>
+            <w:r>
+              <w:rPr>
+                <w:sz w:val="22"/>
+                <w:szCs w:val="22"/>
+              </w:rPr>
+              <w:t>The same contextual signals that can be used to exploit emotional vulnerabilities — grief, health conditions, financial stress — should instead trigger protective design responses: suppressing exploitative content categories, surfacing proactive opt-out prompts, and treating item-level refusals as categorical preference signals. The ethical inversion of dp_025 and dp_026: context data used for protection, not targeting. Agentic AI is uniquely positioned to apply this tactic via real-time language signal detection.</w:t>
+            </w:r>
+          </w:p>
+        </w:tc>
+        <w:tc>
+          <w:tcPr>
+            <w:tcW w:w="2360" w:type="dxa"/>
+            <w:tcBorders>
+              <w:top w:val="single" w:sz="1" w:space="0" w:color="CCCCCC"/>
+              <w:left w:val="single" w:sz="1" w:space="0" w:color="CCCCCC"/>
+              <w:bottom w:val="single" w:sz="1" w:space="0" w:color="CCCCCC"/>
+              <w:right w:val="single" w:sz="1" w:space="0" w:color="CCCCCC"/>
+            </w:tcBorders>
+            <w:shd w:val="clear" w:color="auto" w:fill="FFFFFF"/>
+            <w:tcMar>
+              <w:top w:w="80" w:type="dxa"/>
+              <w:left w:w="120" w:type="dxa"/>
+              <w:bottom w:w="80" w:type="dxa"/>
+              <w:right w:w="120" w:type="dxa"/>
+            </w:tcMar>
+          </w:tcPr>
+          <w:p>
+            <w:r>
+              <w:rPr>
+                <w:sz w:val="22"/>
+                <w:szCs w:val="22"/>
+              </w:rPr>
+              <w:t>Protect, Support User Goals | Zero, Aware, Informed, Deciding</w:t>
             </w:r>
           </w:p>
         </w:tc>
@@ -8273,23 +7918,7 @@
                 <w:sz w:val="22"/>
                 <w:szCs w:val="22"/>
               </w:rPr>
-              <w:t xml:space="preserve">Deploying tactics linked to </w:t>
-            </w:r>
-            <w:proofErr w:type="spellStart"/>
-            <w:r>
-              <w:rPr>
-                <w:sz w:val="22"/>
-                <w:szCs w:val="22"/>
-              </w:rPr>
-              <w:t>HIGH-risk</w:t>
-            </w:r>
-            <w:proofErr w:type="spellEnd"/>
-            <w:r>
-              <w:rPr>
-                <w:sz w:val="22"/>
-                <w:szCs w:val="22"/>
-              </w:rPr>
-              <w:t xml:space="preserve"> biases without explicit safeguard mechanisms.</w:t>
+              <w:t>Deploying tactics linked to HIGH-risk biases without explicit safeguard mechanisms.</w:t>
             </w:r>
           </w:p>
         </w:tc>
@@ -8933,21 +8562,12 @@
             </w:tcMar>
           </w:tcPr>
           <w:p>
-            <w:proofErr w:type="spellStart"/>
-            <w:r>
-              <w:rPr>
-                <w:sz w:val="22"/>
-                <w:szCs w:val="22"/>
-              </w:rPr>
-              <w:t>HIGH-risk</w:t>
-            </w:r>
-            <w:proofErr w:type="spellEnd"/>
-            <w:r>
-              <w:rPr>
-                <w:sz w:val="22"/>
-                <w:szCs w:val="22"/>
-              </w:rPr>
-              <w:t xml:space="preserve"> biases are flagged; specified safeguards are implemented.</w:t>
+            <w:r>
+              <w:rPr>
+                <w:sz w:val="22"/>
+                <w:szCs w:val="22"/>
+              </w:rPr>
+              <w:t>HIGH-risk biases are flagged; specified safeguards are implemented.</w:t>
             </w:r>
           </w:p>
         </w:tc>
@@ -8969,21 +8589,12 @@
             </w:tcMar>
           </w:tcPr>
           <w:p>
-            <w:proofErr w:type="spellStart"/>
-            <w:r>
-              <w:rPr>
-                <w:sz w:val="22"/>
-                <w:szCs w:val="22"/>
-              </w:rPr>
-              <w:t>HIGH-risk</w:t>
-            </w:r>
-            <w:proofErr w:type="spellEnd"/>
-            <w:r>
-              <w:rPr>
-                <w:sz w:val="22"/>
-                <w:szCs w:val="22"/>
-              </w:rPr>
-              <w:t xml:space="preserve"> bias activation with no corresponding safeguard.</w:t>
+            <w:r>
+              <w:rPr>
+                <w:sz w:val="22"/>
+                <w:szCs w:val="22"/>
+              </w:rPr>
+              <w:t>HIGH-risk bias activation with no corresponding safeguard.</w:t>
             </w:r>
           </w:p>
         </w:tc>
@@ -9304,23 +8915,7 @@
                 <w:sz w:val="22"/>
                 <w:szCs w:val="22"/>
               </w:rPr>
-              <w:t xml:space="preserve">Explicit, </w:t>
-            </w:r>
-            <w:proofErr w:type="gramStart"/>
-            <w:r>
-              <w:rPr>
-                <w:sz w:val="22"/>
-                <w:szCs w:val="22"/>
-              </w:rPr>
-              <w:t>low-friction</w:t>
-            </w:r>
-            <w:proofErr w:type="gramEnd"/>
-            <w:r>
-              <w:rPr>
-                <w:sz w:val="22"/>
-                <w:szCs w:val="22"/>
-              </w:rPr>
-              <w:t xml:space="preserve"> exit and undo options at every decision point.</w:t>
+              <w:t>Explicit, low-friction exit and undo options at every decision point.</w:t>
             </w:r>
           </w:p>
         </w:tc>
@@ -9410,12 +9005,6 @@
                 <w:szCs w:val="22"/>
               </w:rPr>
               <w:t xml:space="preserve">Are all evidence, social proof, urgency, and authority claims </w:t>
-            </w:r>
-            <w:r>
-              <w:rPr>
-                <w:sz w:val="22"/>
-                <w:szCs w:val="22"/>
-              </w:rPr>
               <w:lastRenderedPageBreak/>
               <w:t>grounded in accurate data?</w:t>
             </w:r>
@@ -9473,12 +9062,6 @@
                 <w:szCs w:val="22"/>
               </w:rPr>
               <w:t xml:space="preserve">Manufactured urgency, exaggerated consensus, </w:t>
-            </w:r>
-            <w:r>
-              <w:rPr>
-                <w:sz w:val="22"/>
-                <w:szCs w:val="22"/>
-              </w:rPr>
               <w:lastRenderedPageBreak/>
               <w:t>or unrepresentative examples.</w:t>
             </w:r>
@@ -9600,31 +9183,15 @@
         <w:spacing w:after="120"/>
       </w:pPr>
       <w:r>
-        <w:t xml:space="preserve">The dark pattern library draws on four established taxonomies: </w:t>
-      </w:r>
-      <w:proofErr w:type="spellStart"/>
-      <w:r>
-        <w:t>Brignull</w:t>
-      </w:r>
-      <w:proofErr w:type="spellEnd"/>
-      <w:r>
-        <w:t xml:space="preserve"> (</w:t>
-      </w:r>
-      <w:proofErr w:type="spellStart"/>
-      <w:r>
-        <w:t>deceptive.design</w:t>
-      </w:r>
-      <w:proofErr w:type="spellEnd"/>
-      <w:r>
-        <w:t xml:space="preserve">, 2010), the foundational practitioner taxonomy; Mathur et al. (2019), a large-scale empirical study of dark patterns in e-commerce; Gray et al. (2018), a practitioner-centered UX classification; and Bösch et al. (2016), a privacy-focused dark strategy analysis. Two patterns extend categories identified in </w:t>
-      </w:r>
-      <w:proofErr w:type="spellStart"/>
-      <w:r>
-        <w:t>DarkBench</w:t>
-      </w:r>
-      <w:proofErr w:type="spellEnd"/>
-      <w:r>
-        <w:t xml:space="preserve"> (Jauhar et al., 2025), the first systematic benchmark of dark patterns in large language model outputs. Four patterns — False Confidence/Calibration Deception, Epistemic Cowardice, Proactive Manipulation, and Autonomy Erosion — have no equivalent in any prior taxonomy and are original contributions of this framework.</w:t>
+        <w:t>The dark pattern library draws on four established taxonomies: Brignull (deceptive.design, 2010), the foundational practitioner taxonomy; Mathur et al. (2019), a large-scale empirical study of dark patterns in e-commerce; Gray et al. (2018), a practitioner-centered UX classification; and Bösch et al. (2016), a privacy-focused dark strategy analysis. Two patterns extend categories identified in DarkBench (Jauhar et al., 2025), the first systematic benchmark of dark patterns in large language model outputs. Seven patterns have no equivalent in any prior taxonomy and are original contributions of this framework: four agentic-specific originals (False Confidence/Calibration Deception, Epistemic Cowardice, Proactive Manipulation, and Autonomy Erosion) and three engagement ethics originals (Emotional Vulnerability Exploitation, Consent Rerouting, and Incentive Signal Exploitation). The latter three are grounded in documented commercial practice; Incentive Signal Exploitation is additionally grounded in empirical research on AI agent behavior in social contexts (MoltNet, arXiv:2602.13458, 2026).</w:t>
+      </w:r>
+    </w:p>
+    <w:p>
+      <w:pPr>
+        <w:spacing w:after="120"/>
+      </w:pPr>
+      <w:r>
+        <w:t>An independently developed framework, the Cognitive Attack Taxonomy (CAT, cognitiveattacktaxonomy.org), was identified during this framework’s development as a structural parallel. CAT organizes cognitive manipulation entries in a three-layer V-E-T structure (Vulnerabilities → Exploits → Tactics, Techniques, Procedures) that maps directly to the Engaging Me architecture (Biases → Tactics → Dark Patterns). CAT’s Layer 8 (human cognition, biases, heuristics) is the zone where the two frameworks overlap most closely; CAT additionally addresses organizational (Layer 9) and legal (Layer 10) dimensions not currently in scope for Engaging Me. CAT provides independent citation support for several bias entries (notably Decision Fatigue, CAT-2022-050) and introduces a maturity classification dimension (Theoretical → Proof-of-Concept → Observed in Wild → In Common Use → Well-Established) that enriches severity characterization for new pattern entries. The convergence of independently developed frameworks on the same three-layer architecture constitutes external validation of the Engaging Me model’s conceptual structure. Source contributed by Sean [contributor]; full compatibility assessment available in the Engaging Me project repository.</w:t>
       </w:r>
     </w:p>
     <w:p>
@@ -9640,7 +9207,7 @@
         <w:spacing w:after="120"/>
       </w:pPr>
       <w:r>
-        <w:t>The 54-entry cognitive bias library draws on established behavioral science literature spanning Kahneman &amp; Tversky (1974–1992), Cialdini (1984), Zajonc (1968), and a broad literature base documented in the accompanying attribution audit. The Backfire Effect entry reflects contested replication status (Nyhan &amp; Reifler, 2010; Wood &amp; Porter, 2019) and is described accordingly.</w:t>
+        <w:t>The 55-entry cognitive bias library draws on established behavioral science literature spanning Kahneman &amp; Tversky (1974–1992), Cialdini (1984), Zajonc (1968), and a broad literature base documented in the accompanying attribution audit. The Backfire Effect entry reflects contested replication status (Nyhan &amp; Reifler, 2010; Wood &amp; Porter, 2019) and is described accordingly. Decision Fatigue was added in April 2026 following gap analysis during compatibility assessment with the Cognitive Attack Taxonomy (CAT-2022-050); it draws on Danziger et al. (2011) for naturalistic evidence and Baumeister et al. (1998) for foundational ego depletion research, with replication caveats noted per Hagger et al. (2016).</w:t>
       </w:r>
     </w:p>
     <w:p>
@@ -9769,7 +9336,7 @@
         <w:t>Computational analysis.</w:t>
       </w:r>
       <w:r>
-        <w:t xml:space="preserve"> The bias-tactic mapping in the source database is complete — all 54 biases are linked to the tactics that activate them, and all 24 dark patterns are linked to their counterpart tactics and biases. The next step is building computational tools that leverage these structured links for automated audit, pattern detection, and production monitoring of agent behavior.</w:t>
+        <w:t xml:space="preserve"> The bias-tactic mapping in the source database is complete — all 55 biases are linked to the tactics that activate them, and all 27 dark patterns are linked to their counterpart tactics and biases. The next step is building computational tools that leverage these structured links for automated audit, pattern detection, and production monitoring of agent behavior.</w:t>
       </w:r>
     </w:p>
     <w:p>
@@ -9872,15 +9439,7 @@
         <w:spacing w:after="120"/>
       </w:pPr>
       <w:r>
-        <w:t xml:space="preserve">Vangie Stice-Israel, Heidi Given, Masha </w:t>
-      </w:r>
-      <w:proofErr w:type="spellStart"/>
-      <w:r>
-        <w:t>Tatianina</w:t>
-      </w:r>
-      <w:proofErr w:type="spellEnd"/>
-      <w:r>
-        <w:t>, Jeff Pass, and Peter Kaizer — all practitioners in UX design and research — provided expert sanity checks as the framework developed. Their grounded, practitioner perspective kept the work honest.</w:t>
+        <w:t>Vangie Stice-Israel, Heidi Given, Masha Tatianina, Jeff Pass, and Peter Kaizer — all practitioners in UX design and research — provided expert sanity checks as the framework developed. Their grounded, practitioner perspective kept the work honest.</w:t>
       </w:r>
     </w:p>
     <w:p>
@@ -9943,15 +9502,7 @@
         <w:ind w:left="720" w:hanging="720"/>
       </w:pPr>
       <w:r>
-        <w:t xml:space="preserve">Bösch, C., Erb, B., Kargl, F., Kopp, H., &amp; </w:t>
-      </w:r>
-      <w:proofErr w:type="spellStart"/>
-      <w:r>
-        <w:t>Pfattheicher</w:t>
-      </w:r>
-      <w:proofErr w:type="spellEnd"/>
-      <w:r>
-        <w:t xml:space="preserve">, S. (2016). Tales from the dark side: Privacy dark strategies and privacy dark patterns. </w:t>
+        <w:t xml:space="preserve">Bösch, C., Erb, B., Kargl, F., Kopp, H., &amp; Pfattheicher, S. (2016). Tales from the dark side: Privacy dark strategies and privacy dark patterns. </w:t>
       </w:r>
       <w:r>
         <w:rPr>
@@ -9988,13 +9539,8 @@
         <w:spacing w:after="80"/>
         <w:ind w:left="720" w:hanging="720"/>
       </w:pPr>
-      <w:proofErr w:type="spellStart"/>
-      <w:r>
-        <w:t>Brignull</w:t>
-      </w:r>
-      <w:proofErr w:type="spellEnd"/>
-      <w:r>
-        <w:t>, H. (2010). Dark Patterns. Retrieved from https://www.deceptive.design/</w:t>
+      <w:r>
+        <w:t>Brignull, H. (2010). Dark Patterns. Retrieved from https://www.deceptive.design/</w:t>
       </w:r>
     </w:p>
     <w:p>
@@ -10060,23 +9606,7 @@
         <w:ind w:left="720" w:hanging="720"/>
       </w:pPr>
       <w:r>
-        <w:t xml:space="preserve">Evans, </w:t>
-      </w:r>
-      <w:proofErr w:type="spellStart"/>
-      <w:r>
-        <w:t>J.St.B.T</w:t>
-      </w:r>
-      <w:proofErr w:type="spellEnd"/>
-      <w:r>
-        <w:t xml:space="preserve">., </w:t>
-      </w:r>
-      <w:proofErr w:type="spellStart"/>
-      <w:r>
-        <w:t>Barston</w:t>
-      </w:r>
-      <w:proofErr w:type="spellEnd"/>
-      <w:r>
-        <w:t xml:space="preserve">, J.L., &amp; Pollard, P. (1983). On the conflict between logic and belief in syllogistic reasoning. </w:t>
+        <w:t xml:space="preserve">Evans, J.St.B.T., Barston, J.L., &amp; Pollard, P. (1983). On the conflict between logic and belief in syllogistic reasoning. </w:t>
       </w:r>
       <w:r>
         <w:rPr>
@@ -10190,15 +9720,7 @@
         <w:ind w:left="720" w:hanging="720"/>
       </w:pPr>
       <w:r>
-        <w:t xml:space="preserve">Jauhar, S.K., Siddiqui, I., Tram, T., Gabriel, I., &amp; Dragan, A. (2025). </w:t>
-      </w:r>
-      <w:proofErr w:type="spellStart"/>
-      <w:r>
-        <w:t>DarkBench</w:t>
-      </w:r>
-      <w:proofErr w:type="spellEnd"/>
-      <w:r>
-        <w:t xml:space="preserve">: Benchmarking dark patterns in large language models. </w:t>
+        <w:t xml:space="preserve">Jauhar, S.K., Siddiqui, I., Tram, T., Gabriel, I., &amp; Dragan, A. (2025). DarkBench: Benchmarking dark patterns in large language models. </w:t>
       </w:r>
       <w:r>
         <w:rPr>
@@ -10217,15 +9739,7 @@
         <w:ind w:left="720" w:hanging="720"/>
       </w:pPr>
       <w:r>
-        <w:t xml:space="preserve">Jecker, J., &amp; Landy, D. (1969). Liking a person as a function of doing him a </w:t>
-      </w:r>
-      <w:proofErr w:type="spellStart"/>
-      <w:r>
-        <w:t>favour</w:t>
-      </w:r>
-      <w:proofErr w:type="spellEnd"/>
-      <w:r>
-        <w:t xml:space="preserve">. </w:t>
+        <w:t xml:space="preserve">Jecker, J., &amp; Landy, D. (1969). Liking a person as a function of doing him a favour. </w:t>
       </w:r>
       <w:r>
         <w:rPr>
@@ -10246,21 +9760,12 @@
       <w:r>
         <w:t xml:space="preserve">Kahneman, D., &amp; Tversky, A. (1979). Prospect theory: An analysis of decision under risk. </w:t>
       </w:r>
-      <w:proofErr w:type="spellStart"/>
       <w:r>
         <w:rPr>
           <w:i/>
           <w:iCs/>
         </w:rPr>
-        <w:t>Econometrica</w:t>
-      </w:r>
-      <w:proofErr w:type="spellEnd"/>
-      <w:r>
-        <w:rPr>
-          <w:i/>
-          <w:iCs/>
-        </w:rPr>
-        <w:t>, 47</w:t>
+        <w:t>Econometrica, 47</w:t>
       </w:r>
       <w:r>
         <w:t>(2), 263–291.</w:t>
@@ -10460,15 +9965,7 @@
         <w:ind w:left="720" w:hanging="720"/>
       </w:pPr>
       <w:r>
-        <w:t xml:space="preserve">Parasuraman, R., &amp; </w:t>
-      </w:r>
-      <w:proofErr w:type="spellStart"/>
-      <w:r>
-        <w:t>Manzey</w:t>
-      </w:r>
-      <w:proofErr w:type="spellEnd"/>
-      <w:r>
-        <w:t xml:space="preserve">, D.H. (2010). Complacency and bias in human use of automation. </w:t>
+        <w:t xml:space="preserve">Parasuraman, R., &amp; Manzey, D.H. (2010). Complacency and bias in human use of automation. </w:t>
       </w:r>
       <w:r>
         <w:rPr>
@@ -10563,15 +10060,7 @@
         <w:ind w:left="720" w:hanging="720"/>
       </w:pPr>
       <w:r>
-        <w:t xml:space="preserve">Samuelson, W., &amp; </w:t>
-      </w:r>
-      <w:proofErr w:type="spellStart"/>
-      <w:r>
-        <w:t>Zeckhauser</w:t>
-      </w:r>
-      <w:proofErr w:type="spellEnd"/>
-      <w:r>
-        <w:t xml:space="preserve">, R. (1988). Status quo bias in decision making. </w:t>
+        <w:t xml:space="preserve">Samuelson, W., &amp; Zeckhauser, R. (1988). Status quo bias in decision making. </w:t>
       </w:r>
       <w:r>
         <w:rPr>
@@ -10609,15 +10098,7 @@
         <w:ind w:left="720" w:hanging="720"/>
       </w:pPr>
       <w:r>
-        <w:t xml:space="preserve">Tajfel, H., &amp; Turner, J.C. (1979). An integrative theory of intergroup conflict. In W.G. Austin &amp; S. </w:t>
-      </w:r>
-      <w:proofErr w:type="spellStart"/>
-      <w:r>
-        <w:t>Worchel</w:t>
-      </w:r>
-      <w:proofErr w:type="spellEnd"/>
-      <w:r>
-        <w:t xml:space="preserve"> (Eds.), </w:t>
+        <w:t xml:space="preserve">Tajfel, H., &amp; Turner, J.C. (1979). An integrative theory of intergroup conflict. In W.G. Austin &amp; S. Worchel (Eds.), </w:t>
       </w:r>
       <w:r>
         <w:rPr>
@@ -10770,55 +10251,14 @@
         <w:ind w:left="720" w:hanging="720"/>
       </w:pPr>
       <w:r>
-        <w:t xml:space="preserve">Zeigarnik, B. (1927). Das </w:t>
-      </w:r>
-      <w:proofErr w:type="spellStart"/>
-      <w:r>
-        <w:t>Behalten</w:t>
-      </w:r>
-      <w:proofErr w:type="spellEnd"/>
-      <w:r>
-        <w:t xml:space="preserve"> </w:t>
-      </w:r>
-      <w:proofErr w:type="spellStart"/>
-      <w:r>
-        <w:t>erledigter</w:t>
-      </w:r>
-      <w:proofErr w:type="spellEnd"/>
-      <w:r>
-        <w:t xml:space="preserve"> und </w:t>
-      </w:r>
-      <w:proofErr w:type="spellStart"/>
-      <w:r>
-        <w:t>unerledigter</w:t>
-      </w:r>
-      <w:proofErr w:type="spellEnd"/>
-      <w:r>
-        <w:t xml:space="preserve"> </w:t>
-      </w:r>
-      <w:proofErr w:type="spellStart"/>
-      <w:r>
-        <w:t>Handlungen</w:t>
-      </w:r>
-      <w:proofErr w:type="spellEnd"/>
-      <w:r>
-        <w:t xml:space="preserve">. </w:t>
-      </w:r>
-      <w:proofErr w:type="spellStart"/>
+        <w:t xml:space="preserve">Zeigarnik, B. (1927). Das Behalten erledigter und unerledigter Handlungen. </w:t>
+      </w:r>
       <w:r>
         <w:rPr>
           <w:i/>
           <w:iCs/>
         </w:rPr>
-        <w:t>Psychologische</w:t>
-      </w:r>
-      <w:proofErr w:type="spellEnd"/>
-      <w:r>
-        <w:rPr>
-          <w:i/>
-          <w:iCs/>
-        </w:rPr>
-        <w:t xml:space="preserve"> Forschung, 9</w:t>
+        <w:t>Psychologische Forschung, 9</w:t>
       </w:r>
       <w:r>
         <w:t>, 1–85.</w:t>
@@ -10843,15 +10283,7 @@
         <w:spacing w:after="120"/>
       </w:pPr>
       <w:r>
-        <w:t xml:space="preserve">Complete mapping of all 54 cognitive biases to engagement model tactics, with risk levels and safeguard requirements. Risk levels — HIGH, MODERATE, LOW — reflect the severity of the manipulation potential when the tactic exploits the bias rather than serving the user. All </w:t>
-      </w:r>
-      <w:proofErr w:type="spellStart"/>
-      <w:r>
-        <w:t>HIGH-risk</w:t>
-      </w:r>
-      <w:proofErr w:type="spellEnd"/>
-      <w:r>
-        <w:t xml:space="preserve"> activations require explicit safeguard implementation; MODERATE-risk activations require design review.</w:t>
+        <w:t>Complete mapping of all 54 cognitive biases to engagement model tactics, with risk levels and safeguard requirements. Risk levels — HIGH, MODERATE, LOW — reflect the severity of the manipulation potential when the tactic exploits the bias rather than serving the user. All HIGH-risk activations require explicit safeguard implementation; MODERATE-risk activations require design review.</w:t>
       </w:r>
     </w:p>
     <w:p>
@@ -11538,23 +10970,7 @@
                 <w:sz w:val="22"/>
                 <w:szCs w:val="22"/>
               </w:rPr>
-              <w:t xml:space="preserve">We believe more people agree with us than is </w:t>
-            </w:r>
-            <w:proofErr w:type="gramStart"/>
-            <w:r>
-              <w:rPr>
-                <w:sz w:val="22"/>
-                <w:szCs w:val="22"/>
-              </w:rPr>
-              <w:t>actually the</w:t>
-            </w:r>
-            <w:proofErr w:type="gramEnd"/>
-            <w:r>
-              <w:rPr>
-                <w:sz w:val="22"/>
-                <w:szCs w:val="22"/>
-              </w:rPr>
-              <w:t xml:space="preserve"> case.</w:t>
+              <w:t>We believe more people agree with us than is actually the case.</w:t>
             </w:r>
           </w:p>
         </w:tc>
@@ -11698,12 +11114,6 @@
                 <w:szCs w:val="22"/>
               </w:rPr>
               <w:t xml:space="preserve">Under uncertainty, we look to others' actions as information </w:t>
-            </w:r>
-            <w:r>
-              <w:rPr>
-                <w:sz w:val="22"/>
-                <w:szCs w:val="22"/>
-              </w:rPr>
               <w:lastRenderedPageBreak/>
               <w:t>about what is correct.</w:t>
             </w:r>
@@ -11788,12 +11198,6 @@
                 <w:szCs w:val="22"/>
               </w:rPr>
               <w:t xml:space="preserve">Distinguish authentic from manufactured consensus. Never synthesize or selectively </w:t>
-            </w:r>
-            <w:r>
-              <w:rPr>
-                <w:sz w:val="22"/>
-                <w:szCs w:val="22"/>
-              </w:rPr>
               <w:lastRenderedPageBreak/>
               <w:t>curate social signals.</w:t>
             </w:r>
@@ -12716,12 +12120,6 @@
                 <w:szCs w:val="22"/>
               </w:rPr>
               <w:t xml:space="preserve">Better moral standing happens due to positive </w:t>
-            </w:r>
-            <w:r>
-              <w:rPr>
-                <w:sz w:val="22"/>
-                <w:szCs w:val="22"/>
-              </w:rPr>
               <w:lastRenderedPageBreak/>
               <w:t>outcome; worse due to negative outcome.</w:t>
             </w:r>
@@ -12806,12 +12204,6 @@
                 <w:szCs w:val="22"/>
               </w:rPr>
               <w:t xml:space="preserve">Reinforcement must be tied to behavior and effort, not </w:t>
-            </w:r>
-            <w:r>
-              <w:rPr>
-                <w:sz w:val="22"/>
-                <w:szCs w:val="22"/>
-              </w:rPr>
               <w:lastRenderedPageBreak/>
               <w:t>outcome factors outside user control.</w:t>
             </w:r>
@@ -12956,23 +12348,7 @@
                 <w:sz w:val="22"/>
                 <w:szCs w:val="22"/>
               </w:rPr>
-              <w:t xml:space="preserve">Initial asks must be genuinely </w:t>
-            </w:r>
-            <w:proofErr w:type="gramStart"/>
-            <w:r>
-              <w:rPr>
-                <w:sz w:val="22"/>
-                <w:szCs w:val="22"/>
-              </w:rPr>
-              <w:t>low-stakes</w:t>
-            </w:r>
-            <w:proofErr w:type="gramEnd"/>
-            <w:r>
-              <w:rPr>
-                <w:sz w:val="22"/>
-                <w:szCs w:val="22"/>
-              </w:rPr>
-              <w:t>. Never exploit reciprocity obligation to escalate commitment beyond user goals.</w:t>
+              <w:t>Initial asks must be genuinely low-stakes. Never exploit reciprocity obligation to escalate commitment beyond user goals.</w:t>
             </w:r>
           </w:p>
         </w:tc>
@@ -13806,23 +13182,7 @@
                 <w:sz w:val="22"/>
                 <w:szCs w:val="22"/>
               </w:rPr>
-              <w:t xml:space="preserve">We believe others have higher egocentric bias than they </w:t>
-            </w:r>
-            <w:proofErr w:type="gramStart"/>
-            <w:r>
-              <w:rPr>
-                <w:sz w:val="22"/>
-                <w:szCs w:val="22"/>
-              </w:rPr>
-              <w:t>actually do</w:t>
-            </w:r>
-            <w:proofErr w:type="gramEnd"/>
-            <w:r>
-              <w:rPr>
-                <w:sz w:val="22"/>
-                <w:szCs w:val="22"/>
-              </w:rPr>
-              <w:t>.</w:t>
+              <w:t>We believe others have higher egocentric bias than they actually do.</w:t>
             </w:r>
           </w:p>
         </w:tc>
@@ -14505,7 +13865,6 @@
             </w:tcMar>
           </w:tcPr>
           <w:p>
-            <w:proofErr w:type="spellStart"/>
             <w:r>
               <w:rPr>
                 <w:sz w:val="22"/>
@@ -14513,7 +13872,6 @@
               </w:rPr>
               <w:t>Declinism</w:t>
             </w:r>
-            <w:proofErr w:type="spellEnd"/>
           </w:p>
         </w:tc>
         <w:tc>
@@ -15025,12 +14383,6 @@
                 <w:szCs w:val="22"/>
               </w:rPr>
               <w:t xml:space="preserve">We rely heavily on the first piece of </w:t>
-            </w:r>
-            <w:r>
-              <w:rPr>
-                <w:sz w:val="22"/>
-                <w:szCs w:val="22"/>
-              </w:rPr>
               <w:lastRenderedPageBreak/>
               <w:t>information introduced.</w:t>
             </w:r>
@@ -15088,12 +14440,6 @@
                 <w:szCs w:val="22"/>
               </w:rPr>
               <w:t xml:space="preserve">Frame message as an offer; Show what can be lost or </w:t>
-            </w:r>
-            <w:r>
-              <w:rPr>
-                <w:sz w:val="22"/>
-                <w:szCs w:val="22"/>
-              </w:rPr>
               <w:lastRenderedPageBreak/>
               <w:t>gained; Scarcity/urgency</w:t>
             </w:r>
@@ -15124,12 +14470,6 @@
               </w:rPr>
               <w:lastRenderedPageBreak/>
               <w:t xml:space="preserve">Reference points must be accurate and representative. </w:t>
-            </w:r>
-            <w:r>
-              <w:rPr>
-                <w:sz w:val="22"/>
-                <w:szCs w:val="22"/>
-              </w:rPr>
               <w:lastRenderedPageBreak/>
               <w:t>Never set strategically extreme anchors.</w:t>
             </w:r>
@@ -15417,23 +14757,7 @@
                 <w:sz w:val="22"/>
                 <w:szCs w:val="22"/>
               </w:rPr>
-              <w:t xml:space="preserve">Users must always have clear, </w:t>
-            </w:r>
-            <w:proofErr w:type="gramStart"/>
-            <w:r>
-              <w:rPr>
-                <w:sz w:val="22"/>
-                <w:szCs w:val="22"/>
-              </w:rPr>
-              <w:t>low-friction</w:t>
-            </w:r>
-            <w:proofErr w:type="gramEnd"/>
-            <w:r>
-              <w:rPr>
-                <w:sz w:val="22"/>
-                <w:szCs w:val="22"/>
-              </w:rPr>
-              <w:t xml:space="preserve"> exit paths. Commitment escalation must not prevent changing course.</w:t>
+              <w:t>Users must always have clear, low-friction exit paths. Commitment escalation must not prevent changing course.</w:t>
             </w:r>
           </w:p>
         </w:tc>
@@ -16322,7 +15646,6 @@
             </w:tcMar>
           </w:tcPr>
           <w:p>
-            <w:proofErr w:type="spellStart"/>
             <w:r>
               <w:rPr>
                 <w:sz w:val="22"/>
@@ -16330,7 +15653,6 @@
               </w:rPr>
               <w:t>Tachypsychia</w:t>
             </w:r>
-            <w:proofErr w:type="spellEnd"/>
           </w:p>
         </w:tc>
         <w:tc>
@@ -18329,12 +17651,6 @@
                 <w:szCs w:val="22"/>
               </w:rPr>
               <w:t xml:space="preserve">Collective belief in a claim grows through repeated public </w:t>
-            </w:r>
-            <w:r>
-              <w:rPr>
-                <w:sz w:val="22"/>
-                <w:szCs w:val="22"/>
-              </w:rPr>
               <w:lastRenderedPageBreak/>
               <w:t>assertion, making it feel increasingly credible.</w:t>
             </w:r>
@@ -18419,12 +17735,6 @@
                 <w:szCs w:val="22"/>
               </w:rPr>
               <w:t xml:space="preserve">Information spread must be tied to accuracy, not virality. Note: particularly </w:t>
-            </w:r>
-            <w:r>
-              <w:rPr>
-                <w:sz w:val="22"/>
-                <w:szCs w:val="22"/>
-              </w:rPr>
               <w:lastRenderedPageBreak/>
               <w:t>significant in geopolitical disinformation contexts.</w:t>
             </w:r>
@@ -19054,23 +18364,7 @@
                 <w:sz w:val="22"/>
                 <w:szCs w:val="22"/>
               </w:rPr>
-              <w:t xml:space="preserve">Initial asks must be genuinely </w:t>
-            </w:r>
-            <w:proofErr w:type="gramStart"/>
-            <w:r>
-              <w:rPr>
-                <w:sz w:val="22"/>
-                <w:szCs w:val="22"/>
-              </w:rPr>
-              <w:t>low-stakes</w:t>
-            </w:r>
-            <w:proofErr w:type="gramEnd"/>
-            <w:r>
-              <w:rPr>
-                <w:sz w:val="22"/>
-                <w:szCs w:val="22"/>
-              </w:rPr>
-              <w:t>.</w:t>
+              <w:t>Initial asks must be genuinely low-stakes.</w:t>
             </w:r>
           </w:p>
         </w:tc>
@@ -19419,12 +18713,6 @@
                 <w:szCs w:val="22"/>
               </w:rPr>
               <w:t xml:space="preserve">A positive trait impression spills </w:t>
-            </w:r>
-            <w:r>
-              <w:rPr>
-                <w:sz w:val="22"/>
-                <w:szCs w:val="22"/>
-              </w:rPr>
               <w:lastRenderedPageBreak/>
               <w:t>over into impressions of other traits.</w:t>
             </w:r>
@@ -19482,12 +18770,6 @@
                 <w:szCs w:val="22"/>
               </w:rPr>
               <w:t xml:space="preserve">Exhibit surface appeal; Be likeable; Create </w:t>
-            </w:r>
-            <w:r>
-              <w:rPr>
-                <w:sz w:val="22"/>
-                <w:szCs w:val="22"/>
-              </w:rPr>
               <w:lastRenderedPageBreak/>
               <w:t>familiarity; Craft perception of the source</w:t>
             </w:r>
@@ -19518,12 +18800,6 @@
               </w:rPr>
               <w:lastRenderedPageBreak/>
               <w:t xml:space="preserve">Source credibility must reflect actual </w:t>
-            </w:r>
-            <w:r>
-              <w:rPr>
-                <w:sz w:val="22"/>
-                <w:szCs w:val="22"/>
-              </w:rPr>
               <w:lastRenderedPageBreak/>
               <w:t>competence. Do not use likeability to transfer unearned trust.</w:t>
             </w:r>
@@ -19811,23 +19087,7 @@
                 <w:sz w:val="22"/>
                 <w:szCs w:val="22"/>
               </w:rPr>
-              <w:t xml:space="preserve">Personalization must be based on specific, </w:t>
-            </w:r>
-            <w:proofErr w:type="gramStart"/>
-            <w:r>
-              <w:rPr>
-                <w:sz w:val="22"/>
-                <w:szCs w:val="22"/>
-              </w:rPr>
-              <w:t>individually-sourced</w:t>
-            </w:r>
-            <w:proofErr w:type="gramEnd"/>
-            <w:r>
-              <w:rPr>
-                <w:sz w:val="22"/>
-                <w:szCs w:val="22"/>
-              </w:rPr>
-              <w:t xml:space="preserve"> data. Vague generalizations that feel personal are prohibited.</w:t>
+              <w:t>Personalization must be based on specific, individually-sourced data. Vague generalizations that feel personal are prohibited.</w:t>
             </w:r>
           </w:p>
         </w:tc>

</xml_diff>